<commit_message>
Refactor CV structure and add documentation
- Move thesis grades from degree titles to thesis lines for both degrees
- Update VU3 project with detailed team responsibilities (SFO1, SFO4, SWP, TA)
- Merge duplicate Hochschule Furtwangen entries
- Add Porsche Informatik GmbH company name
- Add .gitignore to exclude temp files and node_modules
- Add AI-friendly README.md with brand guidelines and code patterns
- Remove deprecated files (old CV versions, unused scripts)
- Generate PDF versions of both CVs
</commit_message>
<xml_diff>
--- a/TD_Daniel_Deusing_DE.docx
+++ b/TD_Daniel_Deusing_DE.docx
@@ -108,7 +108,7 @@
               </w:rPr>
               <w:t xml:space="preserve"> </w:t>
             </w:r>
-            <w:hyperlink w:history="1" r:id="rIdcvx_kbgnv4bc0grxee4by">
+            <w:hyperlink w:history="1" r:id="rIdceaye_hqgspqigmzpxyhv">
               <w:r>
                 <w:rPr>
                   <w:rFonts w:ascii="Nunito" w:cs="Nunito" w:eastAsia="Nunito" w:hAnsi="Nunito"/>
@@ -175,7 +175,7 @@
               </w:rPr>
               <w:t xml:space="preserve"> </w:t>
             </w:r>
-            <w:hyperlink w:history="1" r:id="rIdevtbfpkjx1vec5fb5dsa_">
+            <w:hyperlink w:history="1" r:id="rId6yfg__86py8airyojpe1f">
               <w:r>
                 <w:rPr>
                   <w:rFonts w:ascii="Nunito" w:cs="Nunito" w:eastAsia="Nunito" w:hAnsi="Nunito"/>
@@ -242,7 +242,7 @@
               </w:rPr>
               <w:t xml:space="preserve"> </w:t>
             </w:r>
-            <w:hyperlink w:history="1" r:id="rIdl2wkzv4o_-d5i7lmgxnxz">
+            <w:hyperlink w:history="1" r:id="rIdoeabpodvkzmfxon_xtpnq">
               <w:r>
                 <w:rPr>
                   <w:rFonts w:ascii="Nunito" w:cs="Nunito" w:eastAsia="Nunito" w:hAnsi="Nunito"/>
@@ -358,18 +358,28 @@
       </w:r>
     </w:p>
     <w:p>
-      <w:pPr>
-        <w:spacing w:after="200"/>
-      </w:pPr>
       <w:r>
         <w:rPr>
           <w:rFonts w:ascii="Nunito" w:cs="Nunito" w:eastAsia="Nunito" w:hAnsi="Nunito"/>
           <w:sz w:val="22"/>
           <w:szCs w:val="22"/>
         </w:rPr>
-        <w:t xml:space="preserve">twiceD Technology GmbH ist ein Softwareunternehmen mit Sitz in Deutschland, spezialisiert auf maßgeschneiderte Entwicklungslösungen für Industrie und Unternehmen. Wir realisieren komplette Projekte oder unterstützen Kundenteams mit erfahrenen Entwicklern in den Bereichen IoT, Embedded Systems, Enterprise-Software und Full-Stack-Entwicklung. Das folgende Mitarbeiterprofil stellt einen unserer Experten vor, der für Ihr Projekt zur Verfügung steht. Eine vollständige Projektübersicht befindet sich derzeit im Aufbau unter </w:t>
-      </w:r>
-      <w:hyperlink w:history="1" r:id="rIdl06pmgngptn6opv1kwxyf">
+        <w:t xml:space="preserve">twiceD Technology GmbH ist ein Softwareunternehmen mit Sitz in Deutschland, spezialisiert auf maßgeschneiderte Entwicklungslösungen für Industrie und Unternehmen. Wir realisieren komplette Projekte oder unterstützen Kundenteams mit erfahrenen Entwicklern in den Bereichen IoT, Embedded Systems, Enterprise-Software und Full-Stack-Entwicklung. Das folgende Mitarbeiterprofil stellt einen unserer Experten vor.</w:t>
+      </w:r>
+    </w:p>
+    <w:p>
+      <w:pPr>
+        <w:spacing w:after="60"/>
+      </w:pPr>
+      <w:r>
+        <w:rPr>
+          <w:rFonts w:ascii="Nunito" w:cs="Nunito" w:eastAsia="Nunito" w:hAnsi="Nunito"/>
+          <w:sz w:val="22"/>
+          <w:szCs w:val="22"/>
+        </w:rPr>
+        <w:t xml:space="preserve">Eine vollständige Projektübersicht befindet sich derzeit im Aufbau unter </w:t>
+      </w:r>
+      <w:hyperlink w:history="1" r:id="rIdlrujlus4y5ezzyvbgbtoy">
         <w:r>
           <w:rPr>
             <w:rFonts w:ascii="Nunito" w:cs="Nunito" w:eastAsia="Nunito" w:hAnsi="Nunito"/>
@@ -416,7 +426,7 @@
         <w:rPr>
           <w:rFonts w:ascii="Nunito" w:cs="Nunito" w:eastAsia="Nunito" w:hAnsi="Nunito"/>
         </w:rPr>
-        <w:t xml:space="preserve"> in Full-Stack-Entwicklung, IoT, Embedded Systems und Enterprise-Software. Nachgewiesene Erfolge in der Leitung von Entwicklungsteams und der Bereitstellung missionskritischer Systeme für Kunden aus Automobil-, Verteidigungs- und Industriebranche. Kombiniert technische Hands-on-Expertise mit Führungskompetenz – von der Architekturplanung über die Implementierung bis zum Produktivbetrieb. Erfahrung in agilen, verteilten Teams und internationalen Projekten.</w:t>
+        <w:t xml:space="preserve"> in Full-Stack-Entwicklung, IoT, Embedded Systems und Enterprise-Software. Nachgewiesene Erfolge in der Leitung von Entwicklungsteams und Bereitstellung missionskritischer Systeme für Automobil-, Verteidigungs- und Industriekunden. Stark im systematischen Debugging und der Root-Cause-Analyse komplexer Probleme. Erfahren im Code-Review mit Fokus auf Wissenstransfer und Teamentwicklung. Kombiniert technische Hands-on-Expertise mit Führungskompetenz – von der Architekturplanung über die Implementierung bis zum Produktivbetrieb. Kommunikationsstark in Deutsch, Englisch und Spanisch. Erfahrung in agilen, verteilten Teams und internationalen Projekten.</w:t>
       </w:r>
     </w:p>
     <w:p>
@@ -424,12 +434,12 @@
         <w:pStyle w:val="SectionHeader"/>
       </w:pPr>
       <w:r>
-        <w:t xml:space="preserve">Kernkompetenzen</w:t>
+        <w:t xml:space="preserve">Technische Fähigkeiten</w:t>
       </w:r>
     </w:p>
     <w:tbl>
       <w:tblPr>
-        <w:tblW w:type="auto" w:w="100"/>
+        <w:tblW w:type="pct" w:w="100%"/>
         <w:tblBorders>
           <w:top w:val="single" w:color="auto" w:sz="4"/>
           <w:left w:val="single" w:color="auto" w:sz="4"/>
@@ -440,14 +450,13 @@
         </w:tblBorders>
       </w:tblPr>
       <w:tblGrid>
-        <w:gridCol w:w="3333"/>
-        <w:gridCol w:w="3333"/>
-        <w:gridCol w:w="3334"/>
+        <w:gridCol w:w="2800"/>
+        <w:gridCol w:w="7200"/>
       </w:tblGrid>
       <w:tr>
         <w:tc>
           <w:tcPr>
-            <w:tcW w:type="dxa" w:w="3333"/>
+            <w:tcW w:type="dxa" w:w="2800"/>
             <w:tcBorders>
               <w:top w:val="none" w:color="FFFFFF" w:sz="0"/>
               <w:left w:val="none" w:color="FFFFFF" w:sz="0"/>
@@ -457,68 +466,105 @@
           </w:tcPr>
           <w:p>
             <w:pPr>
-              <w:pStyle w:val="ListParagraph"/>
-              <w:numPr>
-                <w:ilvl w:val="0"/>
-                <w:numId w:val="2"/>
-              </w:numPr>
+              <w:spacing w:before="40" w:after="40"/>
             </w:pPr>
             <w:r>
               <w:rPr>
                 <w:rFonts w:ascii="Nunito" w:cs="Nunito" w:eastAsia="Nunito" w:hAnsi="Nunito"/>
-              </w:rPr>
-              <w:t xml:space="preserve">Java / Spring / OSGi</w:t>
-            </w:r>
-          </w:p>
+                <w:b/>
+                <w:bCs/>
+                <w:color w:val="1E3A5F"/>
+                <w:sz w:val="20"/>
+                <w:szCs w:val="20"/>
+              </w:rPr>
+              <w:t xml:space="preserve">Programmierung</w:t>
+            </w:r>
+          </w:p>
+        </w:tc>
+        <w:tc>
+          <w:tcPr>
+            <w:tcW w:type="dxa" w:w="7200"/>
+            <w:tcBorders>
+              <w:top w:val="none" w:color="FFFFFF" w:sz="0"/>
+              <w:left w:val="none" w:color="FFFFFF" w:sz="0"/>
+              <w:bottom w:val="none" w:color="FFFFFF" w:sz="0"/>
+              <w:right w:val="none" w:color="FFFFFF" w:sz="0"/>
+            </w:tcBorders>
+          </w:tcPr>
           <w:p>
             <w:pPr>
-              <w:pStyle w:val="ListParagraph"/>
-              <w:numPr>
-                <w:ilvl w:val="0"/>
-                <w:numId w:val="2"/>
-              </w:numPr>
+              <w:spacing w:before="40" w:after="40"/>
             </w:pPr>
             <w:r>
               <w:rPr>
                 <w:rFonts w:ascii="Nunito" w:cs="Nunito" w:eastAsia="Nunito" w:hAnsi="Nunito"/>
-              </w:rPr>
-              <w:t xml:space="preserve">Python</w:t>
-            </w:r>
-          </w:p>
+                <w:sz w:val="20"/>
+                <w:szCs w:val="20"/>
+              </w:rPr>
+              <w:t xml:space="preserve">Java, Python, C, TypeScript/JavaScript, C++, Bash</w:t>
+            </w:r>
+          </w:p>
+        </w:tc>
+      </w:tr>
+      <w:tr>
+        <w:tc>
+          <w:tcPr>
+            <w:tcW w:type="dxa" w:w="2800"/>
+            <w:tcBorders>
+              <w:top w:val="none" w:color="FFFFFF" w:sz="0"/>
+              <w:left w:val="none" w:color="FFFFFF" w:sz="0"/>
+              <w:bottom w:val="none" w:color="FFFFFF" w:sz="0"/>
+              <w:right w:val="none" w:color="FFFFFF" w:sz="0"/>
+            </w:tcBorders>
+            <w:shd w:fill="F5F5F5" w:val="clear"/>
+          </w:tcPr>
           <w:p>
             <w:pPr>
-              <w:pStyle w:val="ListParagraph"/>
-              <w:numPr>
-                <w:ilvl w:val="0"/>
-                <w:numId w:val="2"/>
-              </w:numPr>
+              <w:spacing w:before="40" w:after="40"/>
             </w:pPr>
             <w:r>
               <w:rPr>
                 <w:rFonts w:ascii="Nunito" w:cs="Nunito" w:eastAsia="Nunito" w:hAnsi="Nunito"/>
-              </w:rPr>
-              <w:t xml:space="preserve">Angular / TypeScript</w:t>
-            </w:r>
-          </w:p>
+                <w:b/>
+                <w:bCs/>
+                <w:color w:val="1E3A5F"/>
+                <w:sz w:val="20"/>
+                <w:szCs w:val="20"/>
+              </w:rPr>
+              <w:t xml:space="preserve">Frameworks</w:t>
+            </w:r>
+          </w:p>
+        </w:tc>
+        <w:tc>
+          <w:tcPr>
+            <w:tcW w:type="dxa" w:w="7200"/>
+            <w:tcBorders>
+              <w:top w:val="none" w:color="FFFFFF" w:sz="0"/>
+              <w:left w:val="none" w:color="FFFFFF" w:sz="0"/>
+              <w:bottom w:val="none" w:color="FFFFFF" w:sz="0"/>
+              <w:right w:val="none" w:color="FFFFFF" w:sz="0"/>
+            </w:tcBorders>
+            <w:shd w:fill="F5F5F5" w:val="clear"/>
+          </w:tcPr>
           <w:p>
             <w:pPr>
-              <w:pStyle w:val="ListParagraph"/>
-              <w:numPr>
-                <w:ilvl w:val="0"/>
-                <w:numId w:val="2"/>
-              </w:numPr>
+              <w:spacing w:before="40" w:after="40"/>
             </w:pPr>
             <w:r>
               <w:rPr>
                 <w:rFonts w:ascii="Nunito" w:cs="Nunito" w:eastAsia="Nunito" w:hAnsi="Nunito"/>
-              </w:rPr>
-              <w:t xml:space="preserve">C / Embedded</w:t>
-            </w:r>
-          </w:p>
-        </w:tc>
-        <w:tc>
-          <w:tcPr>
-            <w:tcW w:type="dxa" w:w="3333"/>
+                <w:sz w:val="20"/>
+                <w:szCs w:val="20"/>
+              </w:rPr>
+              <w:t xml:space="preserve">Spring Boot, Angular, Flask, OSGi, Hibernate, JUnit, JPA</w:t>
+            </w:r>
+          </w:p>
+        </w:tc>
+      </w:tr>
+      <w:tr>
+        <w:tc>
+          <w:tcPr>
+            <w:tcW w:type="dxa" w:w="2800"/>
             <w:tcBorders>
               <w:top w:val="none" w:color="FFFFFF" w:sz="0"/>
               <w:left w:val="none" w:color="FFFFFF" w:sz="0"/>
@@ -528,68 +574,105 @@
           </w:tcPr>
           <w:p>
             <w:pPr>
-              <w:pStyle w:val="ListParagraph"/>
-              <w:numPr>
-                <w:ilvl w:val="0"/>
-                <w:numId w:val="2"/>
-              </w:numPr>
+              <w:spacing w:before="40" w:after="40"/>
             </w:pPr>
             <w:r>
               <w:rPr>
                 <w:rFonts w:ascii="Nunito" w:cs="Nunito" w:eastAsia="Nunito" w:hAnsi="Nunito"/>
-              </w:rPr>
-              <w:t xml:space="preserve">Docker</w:t>
-            </w:r>
-          </w:p>
+                <w:b/>
+                <w:bCs/>
+                <w:color w:val="1E3A5F"/>
+                <w:sz w:val="20"/>
+                <w:szCs w:val="20"/>
+              </w:rPr>
+              <w:t xml:space="preserve">Cloud &amp; Infrastruktur</w:t>
+            </w:r>
+          </w:p>
+        </w:tc>
+        <w:tc>
+          <w:tcPr>
+            <w:tcW w:type="dxa" w:w="7200"/>
+            <w:tcBorders>
+              <w:top w:val="none" w:color="FFFFFF" w:sz="0"/>
+              <w:left w:val="none" w:color="FFFFFF" w:sz="0"/>
+              <w:bottom w:val="none" w:color="FFFFFF" w:sz="0"/>
+              <w:right w:val="none" w:color="FFFFFF" w:sz="0"/>
+            </w:tcBorders>
+          </w:tcPr>
           <w:p>
             <w:pPr>
-              <w:pStyle w:val="ListParagraph"/>
-              <w:numPr>
-                <w:ilvl w:val="0"/>
-                <w:numId w:val="2"/>
-              </w:numPr>
+              <w:spacing w:before="40" w:after="40"/>
             </w:pPr>
             <w:r>
               <w:rPr>
                 <w:rFonts w:ascii="Nunito" w:cs="Nunito" w:eastAsia="Nunito" w:hAnsi="Nunito"/>
-              </w:rPr>
-              <w:t xml:space="preserve">Linux / Yocto / Treiber</w:t>
-            </w:r>
-          </w:p>
+                <w:sz w:val="20"/>
+                <w:szCs w:val="20"/>
+              </w:rPr>
+              <w:t xml:space="preserve">AWS, Docker, Linux, Yocto/OpenEmbedded</w:t>
+            </w:r>
+          </w:p>
+        </w:tc>
+      </w:tr>
+      <w:tr>
+        <w:tc>
+          <w:tcPr>
+            <w:tcW w:type="dxa" w:w="2800"/>
+            <w:tcBorders>
+              <w:top w:val="none" w:color="FFFFFF" w:sz="0"/>
+              <w:left w:val="none" w:color="FFFFFF" w:sz="0"/>
+              <w:bottom w:val="none" w:color="FFFFFF" w:sz="0"/>
+              <w:right w:val="none" w:color="FFFFFF" w:sz="0"/>
+            </w:tcBorders>
+            <w:shd w:fill="F5F5F5" w:val="clear"/>
+          </w:tcPr>
           <w:p>
             <w:pPr>
-              <w:pStyle w:val="ListParagraph"/>
-              <w:numPr>
-                <w:ilvl w:val="0"/>
-                <w:numId w:val="2"/>
-              </w:numPr>
+              <w:spacing w:before="40" w:after="40"/>
             </w:pPr>
             <w:r>
               <w:rPr>
                 <w:rFonts w:ascii="Nunito" w:cs="Nunito" w:eastAsia="Nunito" w:hAnsi="Nunito"/>
-              </w:rPr>
-              <w:t xml:space="preserve">IoT / Smart Home</w:t>
-            </w:r>
-          </w:p>
+                <w:b/>
+                <w:bCs/>
+                <w:color w:val="1E3A5F"/>
+                <w:sz w:val="20"/>
+                <w:szCs w:val="20"/>
+              </w:rPr>
+              <w:t xml:space="preserve">DevOps &amp; Tools</w:t>
+            </w:r>
+          </w:p>
+        </w:tc>
+        <w:tc>
+          <w:tcPr>
+            <w:tcW w:type="dxa" w:w="7200"/>
+            <w:tcBorders>
+              <w:top w:val="none" w:color="FFFFFF" w:sz="0"/>
+              <w:left w:val="none" w:color="FFFFFF" w:sz="0"/>
+              <w:bottom w:val="none" w:color="FFFFFF" w:sz="0"/>
+              <w:right w:val="none" w:color="FFFFFF" w:sz="0"/>
+            </w:tcBorders>
+            <w:shd w:fill="F5F5F5" w:val="clear"/>
+          </w:tcPr>
           <w:p>
             <w:pPr>
-              <w:pStyle w:val="ListParagraph"/>
-              <w:numPr>
-                <w:ilvl w:val="0"/>
-                <w:numId w:val="2"/>
-              </w:numPr>
+              <w:spacing w:before="40" w:after="40"/>
             </w:pPr>
             <w:r>
               <w:rPr>
                 <w:rFonts w:ascii="Nunito" w:cs="Nunito" w:eastAsia="Nunito" w:hAnsi="Nunito"/>
-              </w:rPr>
-              <w:t xml:space="preserve">KI-Implementierung</w:t>
-            </w:r>
-          </w:p>
-        </w:tc>
-        <w:tc>
-          <w:tcPr>
-            <w:tcW w:type="dxa" w:w="3334"/>
+                <w:sz w:val="20"/>
+                <w:szCs w:val="20"/>
+              </w:rPr>
+              <w:t xml:space="preserve">Git, Jenkins, CI/CD Pipelines, Atlassian Suite (Jira/Confluence)</w:t>
+            </w:r>
+          </w:p>
+        </w:tc>
+      </w:tr>
+      <w:tr>
+        <w:tc>
+          <w:tcPr>
+            <w:tcW w:type="dxa" w:w="2800"/>
             <w:tcBorders>
               <w:top w:val="none" w:color="FFFFFF" w:sz="0"/>
               <w:left w:val="none" w:color="FFFFFF" w:sz="0"/>
@@ -599,222 +682,381 @@
           </w:tcPr>
           <w:p>
             <w:pPr>
-              <w:pStyle w:val="ListParagraph"/>
-              <w:numPr>
-                <w:ilvl w:val="0"/>
-                <w:numId w:val="2"/>
-              </w:numPr>
+              <w:spacing w:before="40" w:after="40"/>
             </w:pPr>
             <w:r>
               <w:rPr>
                 <w:rFonts w:ascii="Nunito" w:cs="Nunito" w:eastAsia="Nunito" w:hAnsi="Nunito"/>
-              </w:rPr>
-              <w:t xml:space="preserve">Teamführung</w:t>
-            </w:r>
-          </w:p>
+                <w:b/>
+                <w:bCs/>
+                <w:color w:val="1E3A5F"/>
+                <w:sz w:val="20"/>
+                <w:szCs w:val="20"/>
+              </w:rPr>
+              <w:t xml:space="preserve">Datenbanken</w:t>
+            </w:r>
+          </w:p>
+        </w:tc>
+        <w:tc>
+          <w:tcPr>
+            <w:tcW w:type="dxa" w:w="7200"/>
+            <w:tcBorders>
+              <w:top w:val="none" w:color="FFFFFF" w:sz="0"/>
+              <w:left w:val="none" w:color="FFFFFF" w:sz="0"/>
+              <w:bottom w:val="none" w:color="FFFFFF" w:sz="0"/>
+              <w:right w:val="none" w:color="FFFFFF" w:sz="0"/>
+            </w:tcBorders>
+          </w:tcPr>
           <w:p>
             <w:pPr>
-              <w:pStyle w:val="ListParagraph"/>
-              <w:numPr>
-                <w:ilvl w:val="0"/>
-                <w:numId w:val="2"/>
-              </w:numPr>
+              <w:spacing w:before="40" w:after="40"/>
             </w:pPr>
             <w:r>
               <w:rPr>
                 <w:rFonts w:ascii="Nunito" w:cs="Nunito" w:eastAsia="Nunito" w:hAnsi="Nunito"/>
-              </w:rPr>
-              <w:t xml:space="preserve">Agile / Scrum</w:t>
-            </w:r>
-          </w:p>
+                <w:sz w:val="20"/>
+                <w:szCs w:val="20"/>
+              </w:rPr>
+              <w:t xml:space="preserve">MySQL, Oracle SQL, PostgreSQL, Redis, MongoDB</w:t>
+            </w:r>
+          </w:p>
+        </w:tc>
+      </w:tr>
+      <w:tr>
+        <w:tc>
+          <w:tcPr>
+            <w:tcW w:type="dxa" w:w="2800"/>
+            <w:tcBorders>
+              <w:top w:val="none" w:color="FFFFFF" w:sz="0"/>
+              <w:left w:val="none" w:color="FFFFFF" w:sz="0"/>
+              <w:bottom w:val="none" w:color="FFFFFF" w:sz="0"/>
+              <w:right w:val="none" w:color="FFFFFF" w:sz="0"/>
+            </w:tcBorders>
+            <w:shd w:fill="F5F5F5" w:val="clear"/>
+          </w:tcPr>
           <w:p>
             <w:pPr>
-              <w:pStyle w:val="ListParagraph"/>
-              <w:numPr>
-                <w:ilvl w:val="0"/>
-                <w:numId w:val="2"/>
-              </w:numPr>
+              <w:spacing w:before="40" w:after="40"/>
             </w:pPr>
             <w:r>
               <w:rPr>
                 <w:rFonts w:ascii="Nunito" w:cs="Nunito" w:eastAsia="Nunito" w:hAnsi="Nunito"/>
-              </w:rPr>
-              <w:t xml:space="preserve">Software-Architektur</w:t>
-            </w:r>
-          </w:p>
+                <w:b/>
+                <w:bCs/>
+                <w:color w:val="1E3A5F"/>
+                <w:sz w:val="20"/>
+                <w:szCs w:val="20"/>
+              </w:rPr>
+              <w:t xml:space="preserve">Architektur &amp; Design</w:t>
+            </w:r>
+          </w:p>
+        </w:tc>
+        <w:tc>
+          <w:tcPr>
+            <w:tcW w:type="dxa" w:w="7200"/>
+            <w:tcBorders>
+              <w:top w:val="none" w:color="FFFFFF" w:sz="0"/>
+              <w:left w:val="none" w:color="FFFFFF" w:sz="0"/>
+              <w:bottom w:val="none" w:color="FFFFFF" w:sz="0"/>
+              <w:right w:val="none" w:color="FFFFFF" w:sz="0"/>
+            </w:tcBorders>
+            <w:shd w:fill="F5F5F5" w:val="clear"/>
+          </w:tcPr>
           <w:p>
             <w:pPr>
-              <w:pStyle w:val="ListParagraph"/>
-              <w:numPr>
-                <w:ilvl w:val="0"/>
-                <w:numId w:val="2"/>
-              </w:numPr>
+              <w:spacing w:before="40" w:after="40"/>
             </w:pPr>
             <w:r>
               <w:rPr>
                 <w:rFonts w:ascii="Nunito" w:cs="Nunito" w:eastAsia="Nunito" w:hAnsi="Nunito"/>
-              </w:rPr>
-              <w:t xml:space="preserve">Projektmanagement</w:t>
+                <w:sz w:val="20"/>
+                <w:szCs w:val="20"/>
+              </w:rPr>
+              <w:t xml:space="preserve">Domain-Driven Design, Microservices, Event-Driven Architecture</w:t>
+            </w:r>
+          </w:p>
+        </w:tc>
+      </w:tr>
+      <w:tr>
+        <w:tc>
+          <w:tcPr>
+            <w:tcW w:type="dxa" w:w="2800"/>
+            <w:tcBorders>
+              <w:top w:val="none" w:color="FFFFFF" w:sz="0"/>
+              <w:left w:val="none" w:color="FFFFFF" w:sz="0"/>
+              <w:bottom w:val="none" w:color="FFFFFF" w:sz="0"/>
+              <w:right w:val="none" w:color="FFFFFF" w:sz="0"/>
+            </w:tcBorders>
+          </w:tcPr>
+          <w:p>
+            <w:pPr>
+              <w:spacing w:before="40" w:after="40"/>
+            </w:pPr>
+            <w:r>
+              <w:rPr>
+                <w:rFonts w:ascii="Nunito" w:cs="Nunito" w:eastAsia="Nunito" w:hAnsi="Nunito"/>
+                <w:b/>
+                <w:bCs/>
+                <w:color w:val="1E3A5F"/>
+                <w:sz w:val="20"/>
+                <w:szCs w:val="20"/>
+              </w:rPr>
+              <w:t xml:space="preserve">Protokolle &amp; APIs</w:t>
+            </w:r>
+          </w:p>
+        </w:tc>
+        <w:tc>
+          <w:tcPr>
+            <w:tcW w:type="dxa" w:w="7200"/>
+            <w:tcBorders>
+              <w:top w:val="none" w:color="FFFFFF" w:sz="0"/>
+              <w:left w:val="none" w:color="FFFFFF" w:sz="0"/>
+              <w:bottom w:val="none" w:color="FFFFFF" w:sz="0"/>
+              <w:right w:val="none" w:color="FFFFFF" w:sz="0"/>
+            </w:tcBorders>
+          </w:tcPr>
+          <w:p>
+            <w:pPr>
+              <w:spacing w:before="40" w:after="40"/>
+            </w:pPr>
+            <w:r>
+              <w:rPr>
+                <w:rFonts w:ascii="Nunito" w:cs="Nunito" w:eastAsia="Nunito" w:hAnsi="Nunito"/>
+                <w:sz w:val="20"/>
+                <w:szCs w:val="20"/>
+              </w:rPr>
+              <w:t xml:space="preserve">REST, SOAP, Swagger/OpenAPI, MQTT, WebSocket</w:t>
+            </w:r>
+          </w:p>
+        </w:tc>
+      </w:tr>
+      <w:tr>
+        <w:tc>
+          <w:tcPr>
+            <w:tcW w:type="dxa" w:w="2800"/>
+            <w:tcBorders>
+              <w:top w:val="none" w:color="FFFFFF" w:sz="0"/>
+              <w:left w:val="none" w:color="FFFFFF" w:sz="0"/>
+              <w:bottom w:val="none" w:color="FFFFFF" w:sz="0"/>
+              <w:right w:val="none" w:color="FFFFFF" w:sz="0"/>
+            </w:tcBorders>
+            <w:shd w:fill="F5F5F5" w:val="clear"/>
+          </w:tcPr>
+          <w:p>
+            <w:pPr>
+              <w:spacing w:before="40" w:after="40"/>
+            </w:pPr>
+            <w:r>
+              <w:rPr>
+                <w:rFonts w:ascii="Nunito" w:cs="Nunito" w:eastAsia="Nunito" w:hAnsi="Nunito"/>
+                <w:b/>
+                <w:bCs/>
+                <w:color w:val="1E3A5F"/>
+                <w:sz w:val="20"/>
+                <w:szCs w:val="20"/>
+              </w:rPr>
+              <w:t xml:space="preserve">Observability</w:t>
+            </w:r>
+          </w:p>
+        </w:tc>
+        <w:tc>
+          <w:tcPr>
+            <w:tcW w:type="dxa" w:w="7200"/>
+            <w:tcBorders>
+              <w:top w:val="none" w:color="FFFFFF" w:sz="0"/>
+              <w:left w:val="none" w:color="FFFFFF" w:sz="0"/>
+              <w:bottom w:val="none" w:color="FFFFFF" w:sz="0"/>
+              <w:right w:val="none" w:color="FFFFFF" w:sz="0"/>
+            </w:tcBorders>
+            <w:shd w:fill="F5F5F5" w:val="clear"/>
+          </w:tcPr>
+          <w:p>
+            <w:pPr>
+              <w:spacing w:before="40" w:after="40"/>
+            </w:pPr>
+            <w:r>
+              <w:rPr>
+                <w:rFonts w:ascii="Nunito" w:cs="Nunito" w:eastAsia="Nunito" w:hAnsi="Nunito"/>
+                <w:sz w:val="20"/>
+                <w:szCs w:val="20"/>
+              </w:rPr>
+              <w:t xml:space="preserve">Grafana, Prometheus, ELK Stack, Application Logging</w:t>
+            </w:r>
+          </w:p>
+        </w:tc>
+      </w:tr>
+      <w:tr>
+        <w:tc>
+          <w:tcPr>
+            <w:tcW w:type="dxa" w:w="2800"/>
+            <w:tcBorders>
+              <w:top w:val="none" w:color="FFFFFF" w:sz="0"/>
+              <w:left w:val="none" w:color="FFFFFF" w:sz="0"/>
+              <w:bottom w:val="none" w:color="FFFFFF" w:sz="0"/>
+              <w:right w:val="none" w:color="FFFFFF" w:sz="0"/>
+            </w:tcBorders>
+          </w:tcPr>
+          <w:p>
+            <w:pPr>
+              <w:spacing w:before="40" w:after="40"/>
+            </w:pPr>
+            <w:r>
+              <w:rPr>
+                <w:rFonts w:ascii="Nunito" w:cs="Nunito" w:eastAsia="Nunito" w:hAnsi="Nunito"/>
+                <w:b/>
+                <w:bCs/>
+                <w:color w:val="1E3A5F"/>
+                <w:sz w:val="20"/>
+                <w:szCs w:val="20"/>
+              </w:rPr>
+              <w:t xml:space="preserve">Security</w:t>
+            </w:r>
+          </w:p>
+        </w:tc>
+        <w:tc>
+          <w:tcPr>
+            <w:tcW w:type="dxa" w:w="7200"/>
+            <w:tcBorders>
+              <w:top w:val="none" w:color="FFFFFF" w:sz="0"/>
+              <w:left w:val="none" w:color="FFFFFF" w:sz="0"/>
+              <w:bottom w:val="none" w:color="FFFFFF" w:sz="0"/>
+              <w:right w:val="none" w:color="FFFFFF" w:sz="0"/>
+            </w:tcBorders>
+          </w:tcPr>
+          <w:p>
+            <w:pPr>
+              <w:spacing w:before="40" w:after="40"/>
+            </w:pPr>
+            <w:r>
+              <w:rPr>
+                <w:rFonts w:ascii="Nunito" w:cs="Nunito" w:eastAsia="Nunito" w:hAnsi="Nunito"/>
+                <w:sz w:val="20"/>
+                <w:szCs w:val="20"/>
+              </w:rPr>
+              <w:t xml:space="preserve">OAuth2, TLS/SSL, LDAP, Identity Provider Integration</w:t>
+            </w:r>
+          </w:p>
+        </w:tc>
+      </w:tr>
+      <w:tr>
+        <w:tc>
+          <w:tcPr>
+            <w:tcW w:type="dxa" w:w="2800"/>
+            <w:tcBorders>
+              <w:top w:val="none" w:color="FFFFFF" w:sz="0"/>
+              <w:left w:val="none" w:color="FFFFFF" w:sz="0"/>
+              <w:bottom w:val="none" w:color="FFFFFF" w:sz="0"/>
+              <w:right w:val="none" w:color="FFFFFF" w:sz="0"/>
+            </w:tcBorders>
+            <w:shd w:fill="F5F5F5" w:val="clear"/>
+          </w:tcPr>
+          <w:p>
+            <w:pPr>
+              <w:spacing w:before="40" w:after="40"/>
+            </w:pPr>
+            <w:r>
+              <w:rPr>
+                <w:rFonts w:ascii="Nunito" w:cs="Nunito" w:eastAsia="Nunito" w:hAnsi="Nunito"/>
+                <w:b/>
+                <w:bCs/>
+                <w:color w:val="1E3A5F"/>
+                <w:sz w:val="20"/>
+                <w:szCs w:val="20"/>
+              </w:rPr>
+              <w:t xml:space="preserve">Methodik</w:t>
+            </w:r>
+          </w:p>
+        </w:tc>
+        <w:tc>
+          <w:tcPr>
+            <w:tcW w:type="dxa" w:w="7200"/>
+            <w:tcBorders>
+              <w:top w:val="none" w:color="FFFFFF" w:sz="0"/>
+              <w:left w:val="none" w:color="FFFFFF" w:sz="0"/>
+              <w:bottom w:val="none" w:color="FFFFFF" w:sz="0"/>
+              <w:right w:val="none" w:color="FFFFFF" w:sz="0"/>
+            </w:tcBorders>
+            <w:shd w:fill="F5F5F5" w:val="clear"/>
+          </w:tcPr>
+          <w:p>
+            <w:pPr>
+              <w:spacing w:before="40" w:after="40"/>
+            </w:pPr>
+            <w:r>
+              <w:rPr>
+                <w:rFonts w:ascii="Nunito" w:cs="Nunito" w:eastAsia="Nunito" w:hAnsi="Nunito"/>
+                <w:sz w:val="20"/>
+                <w:szCs w:val="20"/>
+              </w:rPr>
+              <w:t xml:space="preserve">Scrum, Kanban, Test Driven Development, Requirements Engineering, Code Review</w:t>
+            </w:r>
+          </w:p>
+        </w:tc>
+      </w:tr>
+      <w:tr>
+        <w:tc>
+          <w:tcPr>
+            <w:tcW w:type="dxa" w:w="2800"/>
+            <w:tcBorders>
+              <w:top w:val="none" w:color="FFFFFF" w:sz="0"/>
+              <w:left w:val="none" w:color="FFFFFF" w:sz="0"/>
+              <w:bottom w:val="none" w:color="FFFFFF" w:sz="0"/>
+              <w:right w:val="none" w:color="FFFFFF" w:sz="0"/>
+            </w:tcBorders>
+          </w:tcPr>
+          <w:p>
+            <w:pPr>
+              <w:spacing w:before="40" w:after="40"/>
+            </w:pPr>
+            <w:r>
+              <w:rPr>
+                <w:rFonts w:ascii="Nunito" w:cs="Nunito" w:eastAsia="Nunito" w:hAnsi="Nunito"/>
+                <w:b/>
+                <w:bCs/>
+                <w:color w:val="1E3A5F"/>
+                <w:sz w:val="20"/>
+                <w:szCs w:val="20"/>
+              </w:rPr>
+              <w:t xml:space="preserve">Domänen</w:t>
+            </w:r>
+          </w:p>
+        </w:tc>
+        <w:tc>
+          <w:tcPr>
+            <w:tcW w:type="dxa" w:w="7200"/>
+            <w:tcBorders>
+              <w:top w:val="none" w:color="FFFFFF" w:sz="0"/>
+              <w:left w:val="none" w:color="FFFFFF" w:sz="0"/>
+              <w:bottom w:val="none" w:color="FFFFFF" w:sz="0"/>
+              <w:right w:val="none" w:color="FFFFFF" w:sz="0"/>
+            </w:tcBorders>
+          </w:tcPr>
+          <w:p>
+            <w:pPr>
+              <w:spacing w:before="40" w:after="40"/>
+            </w:pPr>
+            <w:r>
+              <w:rPr>
+                <w:rFonts w:ascii="Nunito" w:cs="Nunito" w:eastAsia="Nunito" w:hAnsi="Nunito"/>
+                <w:sz w:val="20"/>
+                <w:szCs w:val="20"/>
+              </w:rPr>
+              <w:t xml:space="preserve">IoT, Smart Home, Embedded Systems, Linux-Treiber, Enterprise-Software, Automotive</w:t>
             </w:r>
           </w:p>
         </w:tc>
       </w:tr>
     </w:tbl>
     <w:p>
+      <w:r>
+        <w:br w:type="page"/>
+      </w:r>
+    </w:p>
+    <w:p>
       <w:pPr>
         <w:pStyle w:val="SectionHeader"/>
       </w:pPr>
       <w:r>
-        <w:t xml:space="preserve">Persönliche Auszeichnungen</w:t>
-      </w:r>
-    </w:p>
-    <w:tbl>
-      <w:tblPr>
-        <w:tblW w:type="auto" w:w="100"/>
-        <w:tblBorders>
-          <w:top w:val="single" w:color="auto" w:sz="4"/>
-          <w:left w:val="single" w:color="auto" w:sz="4"/>
-          <w:bottom w:val="single" w:color="auto" w:sz="4"/>
-          <w:right w:val="single" w:color="auto" w:sz="4"/>
-          <w:insideH w:val="single" w:color="auto" w:sz="4"/>
-          <w:insideV w:val="single" w:color="auto" w:sz="4"/>
-        </w:tblBorders>
-      </w:tblPr>
-      <w:tblGrid>
-        <w:gridCol w:w="1200"/>
-        <w:gridCol w:w="8800"/>
-      </w:tblGrid>
-      <w:tr>
-        <w:tc>
-          <w:tcPr>
-            <w:tcW w:type="dxa" w:w="1200"/>
-            <w:tcBorders>
-              <w:top w:val="none" w:color="FFFFFF" w:sz="0"/>
-              <w:left w:val="none" w:color="FFFFFF" w:sz="0"/>
-              <w:bottom w:val="none" w:color="FFFFFF" w:sz="0"/>
-              <w:right w:val="none" w:color="FFFFFF" w:sz="0"/>
-            </w:tcBorders>
-            <w:shd w:fill="D0520F" w:val="clear"/>
-            <w:vAlign w:val="center"/>
-          </w:tcPr>
-          <w:p>
-            <w:pPr>
-              <w:jc w:val="center"/>
-            </w:pPr>
-            <w:r>
-              <w:rPr>
-                <w:rFonts w:ascii="Nunito" w:cs="Nunito" w:eastAsia="Nunito" w:hAnsi="Nunito"/>
-                <w:b/>
-                <w:bCs/>
-                <w:color w:val="FFFFFF"/>
-              </w:rPr>
-              <w:t xml:space="preserve">2014</w:t>
-            </w:r>
-          </w:p>
-        </w:tc>
-        <w:tc>
-          <w:tcPr>
-            <w:tcW w:type="dxa" w:w="8800"/>
-            <w:tcBorders>
-              <w:top w:val="none" w:color="FFFFFF" w:sz="0"/>
-              <w:left w:val="none" w:color="FFFFFF" w:sz="0"/>
-              <w:bottom w:val="none" w:color="FFFFFF" w:sz="0"/>
-              <w:right w:val="none" w:color="FFFFFF" w:sz="0"/>
-            </w:tcBorders>
-          </w:tcPr>
-          <w:p>
-            <w:pPr>
-              <w:spacing w:before="60" w:after="60"/>
-              <w:ind w:left="100"/>
-            </w:pPr>
-            <w:r>
-              <w:rPr>
-                <w:rFonts w:ascii="Nunito" w:cs="Nunito" w:eastAsia="Nunito" w:hAnsi="Nunito"/>
-                <w:b/>
-                <w:bCs/>
-              </w:rPr>
-              <w:t xml:space="preserve">Gewinner - Baden-Württemberg Goes Mobile</w:t>
-            </w:r>
-            <w:r>
-              <w:rPr>
-                <w:rFonts w:ascii="Nunito" w:cs="Nunito" w:eastAsia="Nunito" w:hAnsi="Nunito"/>
-              </w:rPr>
-              <w:t xml:space="preserve"> (Kategorie: Mobile Housemate 2.0)</w:t>
-            </w:r>
-          </w:p>
-        </w:tc>
-      </w:tr>
-      <w:tr>
-        <w:tc>
-          <w:tcPr>
-            <w:tcW w:type="dxa" w:w="1200"/>
-            <w:tcBorders>
-              <w:top w:val="none" w:color="FFFFFF" w:sz="0"/>
-              <w:left w:val="none" w:color="FFFFFF" w:sz="0"/>
-              <w:bottom w:val="none" w:color="FFFFFF" w:sz="0"/>
-              <w:right w:val="none" w:color="FFFFFF" w:sz="0"/>
-            </w:tcBorders>
-            <w:shd w:fill="1E3A5F" w:val="clear"/>
-            <w:vAlign w:val="center"/>
-          </w:tcPr>
-          <w:p>
-            <w:pPr>
-              <w:jc w:val="center"/>
-            </w:pPr>
-            <w:r>
-              <w:rPr>
-                <w:rFonts w:ascii="Nunito" w:cs="Nunito" w:eastAsia="Nunito" w:hAnsi="Nunito"/>
-                <w:b/>
-                <w:bCs/>
-                <w:color w:val="FFFFFF"/>
-              </w:rPr>
-              <w:t xml:space="preserve">2013</w:t>
-            </w:r>
-          </w:p>
-        </w:tc>
-        <w:tc>
-          <w:tcPr>
-            <w:tcW w:type="dxa" w:w="8800"/>
-            <w:tcBorders>
-              <w:top w:val="none" w:color="FFFFFF" w:sz="0"/>
-              <w:left w:val="none" w:color="FFFFFF" w:sz="0"/>
-              <w:bottom w:val="none" w:color="FFFFFF" w:sz="0"/>
-              <w:right w:val="none" w:color="FFFFFF" w:sz="0"/>
-            </w:tcBorders>
-          </w:tcPr>
-          <w:p>
-            <w:pPr>
-              <w:spacing w:before="60" w:after="60"/>
-              <w:ind w:left="100"/>
-            </w:pPr>
-            <w:r>
-              <w:rPr>
-                <w:rFonts w:ascii="Nunito" w:cs="Nunito" w:eastAsia="Nunito" w:hAnsi="Nunito"/>
-                <w:b/>
-                <w:bCs/>
-              </w:rPr>
-              <w:t xml:space="preserve">Gewinner - Regional Cup Elevator Pitch Baden-Württemberg</w:t>
-            </w:r>
-            <w:r>
-              <w:rPr>
-                <w:rFonts w:ascii="Nunito" w:cs="Nunito" w:eastAsia="Nunito" w:hAnsi="Nunito"/>
-              </w:rPr>
-              <w:t xml:space="preserve"> (Südschwarzwald)</w:t>
-            </w:r>
-          </w:p>
-        </w:tc>
-      </w:tr>
-    </w:tbl>
-    <w:p>
-      <w:r>
-        <w:br w:type="page"/>
-      </w:r>
-    </w:p>
-    <w:p>
-      <w:pPr>
-        <w:pStyle w:val="SectionHeader"/>
-      </w:pPr>
-      <w:r>
         <w:t xml:space="preserve">Ausgewählte Projekte</w:t>
       </w:r>
     </w:p>
@@ -863,7 +1105,7 @@
         <w:pStyle w:val="ListParagraph"/>
         <w:numPr>
           <w:ilvl w:val="0"/>
-          <w:numId w:val="3"/>
+          <w:numId w:val="2"/>
         </w:numPr>
       </w:pPr>
       <w:r>
@@ -880,7 +1122,7 @@
         <w:pStyle w:val="ListParagraph"/>
         <w:numPr>
           <w:ilvl w:val="0"/>
-          <w:numId w:val="3"/>
+          <w:numId w:val="2"/>
         </w:numPr>
       </w:pPr>
       <w:r>
@@ -897,7 +1139,7 @@
         <w:pStyle w:val="ListParagraph"/>
         <w:numPr>
           <w:ilvl w:val="0"/>
-          <w:numId w:val="3"/>
+          <w:numId w:val="2"/>
         </w:numPr>
       </w:pPr>
       <w:r>
@@ -907,6 +1149,23 @@
           <w:szCs w:val="20"/>
         </w:rPr>
         <w:t xml:space="preserve">Integration einer C-Bibliothek von LITEF für Hochleistungs-Shared-Memory-Zugriff</w:t>
+      </w:r>
+    </w:p>
+    <w:p>
+      <w:pPr>
+        <w:pStyle w:val="ListParagraph"/>
+        <w:numPr>
+          <w:ilvl w:val="0"/>
+          <w:numId w:val="2"/>
+        </w:numPr>
+      </w:pPr>
+      <w:r>
+        <w:rPr>
+          <w:rFonts w:ascii="Nunito" w:cs="Nunito" w:eastAsia="Nunito" w:hAnsi="Nunito"/>
+          <w:sz w:val="20"/>
+          <w:szCs w:val="20"/>
+        </w:rPr>
+        <w:t xml:space="preserve">Laufende Wartung: Sicherheitsupdates, Performance-Optimierungen und Fehlerbehebung</w:t>
       </w:r>
     </w:p>
     <w:p>
@@ -947,7 +1206,7 @@
         <w:pStyle w:val="CompanyRole"/>
       </w:pPr>
       <w:r>
-        <w:t xml:space="preserve">Cloudflight GmbH / Porsche Informatik | Softwareentwickler &amp; Architekt | 2021 – heute</w:t>
+        <w:t xml:space="preserve">Cloudflight GmbH / Porsche Informatik GmbH | Softwareentwickler &amp; Architekt | 2021 – heute</w:t>
       </w:r>
     </w:p>
     <w:p>
@@ -965,50 +1224,67 @@
         <w:pStyle w:val="ListParagraph"/>
         <w:numPr>
           <w:ilvl w:val="0"/>
-          <w:numId w:val="3"/>
-        </w:numPr>
-      </w:pPr>
-      <w:r>
-        <w:rPr>
-          <w:rFonts w:ascii="Nunito" w:cs="Nunito" w:eastAsia="Nunito" w:hAnsi="Nunito"/>
-          <w:sz w:val="20"/>
-          <w:szCs w:val="20"/>
-        </w:rPr>
-        <w:t xml:space="preserve">Mitglied des Architekten-Teams; Problemlöser für komplexe technische Herausforderungen und Anforderungsanalyse</w:t>
-      </w:r>
-    </w:p>
-    <w:p>
-      <w:pPr>
-        <w:pStyle w:val="ListParagraph"/>
-        <w:numPr>
-          <w:ilvl w:val="0"/>
-          <w:numId w:val="3"/>
-        </w:numPr>
-      </w:pPr>
-      <w:r>
-        <w:rPr>
-          <w:rFonts w:ascii="Nunito" w:cs="Nunito" w:eastAsia="Nunito" w:hAnsi="Nunito"/>
-          <w:sz w:val="20"/>
-          <w:szCs w:val="20"/>
-        </w:rPr>
-        <w:t xml:space="preserve">Features in mehreren Modulen umgesetzt: Stocklist, Offer/Contract, DocFlow, Multi-Currency, Special Tax, Vehicle Management</w:t>
-      </w:r>
-    </w:p>
-    <w:p>
-      <w:pPr>
-        <w:pStyle w:val="ListParagraph"/>
-        <w:numPr>
-          <w:ilvl w:val="0"/>
-          <w:numId w:val="3"/>
-        </w:numPr>
-      </w:pPr>
-      <w:r>
-        <w:rPr>
-          <w:rFonts w:ascii="Nunito" w:cs="Nunito" w:eastAsia="Nunito" w:hAnsi="Nunito"/>
-          <w:sz w:val="20"/>
-          <w:szCs w:val="20"/>
-        </w:rPr>
-        <w:t xml:space="preserve">2+ Jahre im SFO1-Team, jetzt in SFO4/SWP: VU3-Entwicklung plus Legacy-Wartung für noch nicht migrierte italienische Händler</w:t>
+          <w:numId w:val="2"/>
+        </w:numPr>
+      </w:pPr>
+      <w:r>
+        <w:rPr>
+          <w:rFonts w:ascii="Nunito" w:cs="Nunito" w:eastAsia="Nunito" w:hAnsi="Nunito"/>
+          <w:sz w:val="20"/>
+          <w:szCs w:val="20"/>
+        </w:rPr>
+        <w:t xml:space="preserve">2 Jahre SFO1-Team: Stocklist, Add-Ons, Buildability &amp; Actuality Check, Salesperson Management, Performance Board, Vehicle Management, Contract Broker, Sales Folder</w:t>
+      </w:r>
+    </w:p>
+    <w:p>
+      <w:pPr>
+        <w:pStyle w:val="ListParagraph"/>
+        <w:numPr>
+          <w:ilvl w:val="0"/>
+          <w:numId w:val="2"/>
+        </w:numPr>
+      </w:pPr>
+      <w:r>
+        <w:rPr>
+          <w:rFonts w:ascii="Nunito" w:cs="Nunito" w:eastAsia="Nunito" w:hAnsi="Nunito"/>
+          <w:sz w:val="20"/>
+          <w:szCs w:val="20"/>
+        </w:rPr>
+        <w:t xml:space="preserve">2+ Jahre SFO4-Team (laufend): Multi-Currency, Special Tax, Porsche Vehicle Integration, DocFlow Integration, Selections, Datahub</w:t>
+      </w:r>
+    </w:p>
+    <w:p>
+      <w:pPr>
+        <w:pStyle w:val="ListParagraph"/>
+        <w:numPr>
+          <w:ilvl w:val="0"/>
+          <w:numId w:val="2"/>
+        </w:numPr>
+      </w:pPr>
+      <w:r>
+        <w:rPr>
+          <w:rFonts w:ascii="Nunito" w:cs="Nunito" w:eastAsia="Nunito" w:hAnsi="Nunito"/>
+          <w:sz w:val="20"/>
+          <w:szCs w:val="20"/>
+        </w:rPr>
+        <w:t xml:space="preserve">½+ Jahr SWP-Team (laufend): Legacy-Verkaufsanwendung Italien – Bug Fixing, Security-/Regulatory-Features, Wartung bis Migration 2027</w:t>
+      </w:r>
+    </w:p>
+    <w:p>
+      <w:pPr>
+        <w:pStyle w:val="ListParagraph"/>
+        <w:numPr>
+          <w:ilvl w:val="0"/>
+          <w:numId w:val="2"/>
+        </w:numPr>
+      </w:pPr>
+      <w:r>
+        <w:rPr>
+          <w:rFonts w:ascii="Nunito" w:cs="Nunito" w:eastAsia="Nunito" w:hAnsi="Nunito"/>
+          <w:sz w:val="20"/>
+          <w:szCs w:val="20"/>
+        </w:rPr>
+        <w:t xml:space="preserve">2+ Jahre Technical Architecture Team (laufend): Domänenübergreifendes Team zur Definition der Gesamtsystemarchitektur</w:t>
       </w:r>
     </w:p>
     <w:p>
@@ -1067,7 +1343,7 @@
         <w:pStyle w:val="ListParagraph"/>
         <w:numPr>
           <w:ilvl w:val="0"/>
-          <w:numId w:val="3"/>
+          <w:numId w:val="2"/>
         </w:numPr>
       </w:pPr>
       <w:r>
@@ -1084,7 +1360,7 @@
         <w:pStyle w:val="ListParagraph"/>
         <w:numPr>
           <w:ilvl w:val="0"/>
-          <w:numId w:val="3"/>
+          <w:numId w:val="2"/>
         </w:numPr>
       </w:pPr>
       <w:r>
@@ -1101,7 +1377,7 @@
         <w:pStyle w:val="ListParagraph"/>
         <w:numPr>
           <w:ilvl w:val="0"/>
-          <w:numId w:val="3"/>
+          <w:numId w:val="2"/>
         </w:numPr>
       </w:pPr>
       <w:r>
@@ -1135,7 +1411,7 @@
           <w:sz w:val="18"/>
           <w:szCs w:val="18"/>
         </w:rPr>
-        <w:t xml:space="preserve">C, Linux Kernel, GigE Vision, FPGA-Integration</w:t>
+        <w:t xml:space="preserve">C, Linux Kernel, GigE Vision</w:t>
       </w:r>
     </w:p>
     <w:p>
@@ -1169,7 +1445,7 @@
         <w:pStyle w:val="ListParagraph"/>
         <w:numPr>
           <w:ilvl w:val="0"/>
-          <w:numId w:val="3"/>
+          <w:numId w:val="2"/>
         </w:numPr>
       </w:pPr>
       <w:r>
@@ -1186,7 +1462,7 @@
         <w:pStyle w:val="ListParagraph"/>
         <w:numPr>
           <w:ilvl w:val="0"/>
-          <w:numId w:val="3"/>
+          <w:numId w:val="2"/>
         </w:numPr>
       </w:pPr>
       <w:r>
@@ -1196,6 +1472,23 @@
           <w:szCs w:val="20"/>
         </w:rPr>
         <w:t xml:space="preserve">Integration in bestehende IHK-Backend-Infrastruktur für nahtlosen Datenaustausch</w:t>
+      </w:r>
+    </w:p>
+    <w:p>
+      <w:pPr>
+        <w:pStyle w:val="ListParagraph"/>
+        <w:numPr>
+          <w:ilvl w:val="0"/>
+          <w:numId w:val="2"/>
+        </w:numPr>
+      </w:pPr>
+      <w:r>
+        <w:rPr>
+          <w:rFonts w:ascii="Nunito" w:cs="Nunito" w:eastAsia="Nunito" w:hAnsi="Nunito"/>
+          <w:sz w:val="20"/>
+          <w:szCs w:val="20"/>
+        </w:rPr>
+        <w:t xml:space="preserve">Laufende Wartung: Updates, Bugfixes und Erweiterungen nach Kundenfeedback</w:t>
       </w:r>
     </w:p>
     <w:p>
@@ -1254,7 +1547,7 @@
         <w:pStyle w:val="ListParagraph"/>
         <w:numPr>
           <w:ilvl w:val="0"/>
-          <w:numId w:val="3"/>
+          <w:numId w:val="2"/>
         </w:numPr>
       </w:pPr>
       <w:r>
@@ -1271,7 +1564,7 @@
         <w:pStyle w:val="ListParagraph"/>
         <w:numPr>
           <w:ilvl w:val="0"/>
-          <w:numId w:val="3"/>
+          <w:numId w:val="2"/>
         </w:numPr>
       </w:pPr>
       <w:r>
@@ -1281,6 +1574,23 @@
           <w:szCs w:val="20"/>
         </w:rPr>
         <w:t xml:space="preserve">Gemeinsame Backend-Infrastruktur mit eFaktura; individuelles Angular-Frontend</w:t>
+      </w:r>
+    </w:p>
+    <w:p>
+      <w:pPr>
+        <w:pStyle w:val="ListParagraph"/>
+        <w:numPr>
+          <w:ilvl w:val="0"/>
+          <w:numId w:val="2"/>
+        </w:numPr>
+      </w:pPr>
+      <w:r>
+        <w:rPr>
+          <w:rFonts w:ascii="Nunito" w:cs="Nunito" w:eastAsia="Nunito" w:hAnsi="Nunito"/>
+          <w:sz w:val="20"/>
+          <w:szCs w:val="20"/>
+        </w:rPr>
+        <w:t xml:space="preserve">Laufende Wartung: Updates, Bugfixes und Erweiterungen nach Kundenfeedback</w:t>
       </w:r>
     </w:p>
     <w:p>
@@ -1339,7 +1649,7 @@
         <w:pStyle w:val="ListParagraph"/>
         <w:numPr>
           <w:ilvl w:val="0"/>
-          <w:numId w:val="3"/>
+          <w:numId w:val="2"/>
         </w:numPr>
       </w:pPr>
       <w:r>
@@ -1356,7 +1666,7 @@
         <w:pStyle w:val="ListParagraph"/>
         <w:numPr>
           <w:ilvl w:val="0"/>
-          <w:numId w:val="3"/>
+          <w:numId w:val="2"/>
         </w:numPr>
       </w:pPr>
       <w:r>
@@ -1373,7 +1683,7 @@
         <w:pStyle w:val="ListParagraph"/>
         <w:numPr>
           <w:ilvl w:val="0"/>
-          <w:numId w:val="3"/>
+          <w:numId w:val="2"/>
         </w:numPr>
       </w:pPr>
       <w:r>
@@ -1407,7 +1717,7 @@
           <w:sz w:val="18"/>
           <w:szCs w:val="18"/>
         </w:rPr>
-        <w:t xml:space="preserve">Android, Java, Bluetooth LE, Material Design</w:t>
+        <w:t xml:space="preserve">Android, Java, Bluetooth LE</w:t>
       </w:r>
     </w:p>
     <w:p>
@@ -1441,7 +1751,7 @@
         <w:pStyle w:val="ListParagraph"/>
         <w:numPr>
           <w:ilvl w:val="0"/>
-          <w:numId w:val="3"/>
+          <w:numId w:val="2"/>
         </w:numPr>
       </w:pPr>
       <w:r>
@@ -1458,7 +1768,7 @@
         <w:pStyle w:val="ListParagraph"/>
         <w:numPr>
           <w:ilvl w:val="0"/>
-          <w:numId w:val="3"/>
+          <w:numId w:val="2"/>
         </w:numPr>
       </w:pPr>
       <w:r>
@@ -1475,7 +1785,7 @@
         <w:pStyle w:val="ListParagraph"/>
         <w:numPr>
           <w:ilvl w:val="0"/>
-          <w:numId w:val="3"/>
+          <w:numId w:val="2"/>
         </w:numPr>
       </w:pPr>
       <w:r>
@@ -1543,7 +1853,7 @@
         <w:pStyle w:val="ListParagraph"/>
         <w:numPr>
           <w:ilvl w:val="0"/>
-          <w:numId w:val="3"/>
+          <w:numId w:val="2"/>
         </w:numPr>
       </w:pPr>
       <w:r>
@@ -1560,7 +1870,7 @@
         <w:pStyle w:val="ListParagraph"/>
         <w:numPr>
           <w:ilvl w:val="0"/>
-          <w:numId w:val="3"/>
+          <w:numId w:val="2"/>
         </w:numPr>
       </w:pPr>
       <w:r>
@@ -1577,7 +1887,7 @@
         <w:pStyle w:val="ListParagraph"/>
         <w:numPr>
           <w:ilvl w:val="0"/>
-          <w:numId w:val="3"/>
+          <w:numId w:val="2"/>
         </w:numPr>
       </w:pPr>
       <w:r>
@@ -1587,6 +1897,23 @@
           <w:szCs w:val="20"/>
         </w:rPr>
         <w:t xml:space="preserve">Intern bei twiceD im Einsatz; externe Kunden als SaaS bedient</w:t>
+      </w:r>
+    </w:p>
+    <w:p>
+      <w:pPr>
+        <w:pStyle w:val="ListParagraph"/>
+        <w:numPr>
+          <w:ilvl w:val="0"/>
+          <w:numId w:val="2"/>
+        </w:numPr>
+      </w:pPr>
+      <w:r>
+        <w:rPr>
+          <w:rFonts w:ascii="Nunito" w:cs="Nunito" w:eastAsia="Nunito" w:hAnsi="Nunito"/>
+          <w:sz w:val="20"/>
+          <w:szCs w:val="20"/>
+        </w:rPr>
+        <w:t xml:space="preserve">Laufende Wartung und Weiterentwicklung basierend auf Nutzerfeedback</w:t>
       </w:r>
     </w:p>
     <w:p>
@@ -1645,7 +1972,7 @@
         <w:pStyle w:val="ListParagraph"/>
         <w:numPr>
           <w:ilvl w:val="0"/>
-          <w:numId w:val="3"/>
+          <w:numId w:val="2"/>
         </w:numPr>
       </w:pPr>
       <w:r>
@@ -1662,7 +1989,7 @@
         <w:pStyle w:val="ListParagraph"/>
         <w:numPr>
           <w:ilvl w:val="0"/>
-          <w:numId w:val="3"/>
+          <w:numId w:val="2"/>
         </w:numPr>
       </w:pPr>
       <w:r>
@@ -1679,7 +2006,7 @@
         <w:pStyle w:val="ListParagraph"/>
         <w:numPr>
           <w:ilvl w:val="0"/>
-          <w:numId w:val="3"/>
+          <w:numId w:val="2"/>
         </w:numPr>
       </w:pPr>
       <w:r>
@@ -1747,7 +2074,7 @@
         <w:pStyle w:val="ListParagraph"/>
         <w:numPr>
           <w:ilvl w:val="0"/>
-          <w:numId w:val="3"/>
+          <w:numId w:val="2"/>
         </w:numPr>
       </w:pPr>
       <w:r>
@@ -1764,7 +2091,7 @@
         <w:pStyle w:val="ListParagraph"/>
         <w:numPr>
           <w:ilvl w:val="0"/>
-          <w:numId w:val="3"/>
+          <w:numId w:val="2"/>
         </w:numPr>
       </w:pPr>
       <w:r>
@@ -1824,32 +2151,32 @@
           <w:sz w:val="20"/>
           <w:szCs w:val="20"/>
         </w:rPr>
-        <w:t xml:space="preserve">Entwicklung einer ICO-Plattform für Influencer-Marketing auf der Stellar-Blockchain.</w:t>
-      </w:r>
-    </w:p>
-    <w:p>
-      <w:pPr>
-        <w:pStyle w:val="ListParagraph"/>
-        <w:numPr>
-          <w:ilvl w:val="0"/>
-          <w:numId w:val="3"/>
-        </w:numPr>
-      </w:pPr>
-      <w:r>
-        <w:rPr>
-          <w:rFonts w:ascii="Nunito" w:cs="Nunito" w:eastAsia="Nunito" w:hAnsi="Nunito"/>
-          <w:sz w:val="20"/>
-          <w:szCs w:val="20"/>
-        </w:rPr>
-        <w:t xml:space="preserve">Smart-Contract-Entwicklung auf Stellar-Netzwerk für Token-Emission und -Handel</w:t>
-      </w:r>
-    </w:p>
-    <w:p>
-      <w:pPr>
-        <w:pStyle w:val="ListParagraph"/>
-        <w:numPr>
-          <w:ilvl w:val="0"/>
-          <w:numId w:val="3"/>
+        <w:t xml:space="preserve">Entwicklung einer ICO-Plattform für Influencer-Marketing auf Blockchain-Basis.</w:t>
+      </w:r>
+    </w:p>
+    <w:p>
+      <w:pPr>
+        <w:pStyle w:val="ListParagraph"/>
+        <w:numPr>
+          <w:ilvl w:val="0"/>
+          <w:numId w:val="2"/>
+        </w:numPr>
+      </w:pPr>
+      <w:r>
+        <w:rPr>
+          <w:rFonts w:ascii="Nunito" w:cs="Nunito" w:eastAsia="Nunito" w:hAnsi="Nunito"/>
+          <w:sz w:val="20"/>
+          <w:szCs w:val="20"/>
+        </w:rPr>
+        <w:t xml:space="preserve">Smart-Contract-Entwicklung für Token-Emission und -Handel</w:t>
+      </w:r>
+    </w:p>
+    <w:p>
+      <w:pPr>
+        <w:pStyle w:val="ListParagraph"/>
+        <w:numPr>
+          <w:ilvl w:val="0"/>
+          <w:numId w:val="2"/>
         </w:numPr>
       </w:pPr>
       <w:r>
@@ -1866,16 +2193,16 @@
         <w:pStyle w:val="ListParagraph"/>
         <w:numPr>
           <w:ilvl w:val="0"/>
-          <w:numId w:val="3"/>
-        </w:numPr>
-      </w:pPr>
-      <w:r>
-        <w:rPr>
-          <w:rFonts w:ascii="Nunito" w:cs="Nunito" w:eastAsia="Nunito" w:hAnsi="Nunito"/>
-          <w:sz w:val="20"/>
-          <w:szCs w:val="20"/>
-        </w:rPr>
-        <w:t xml:space="preserve">Integration von Stellar SDK für Wallet-Verwaltung und Transaktionsabwicklung</w:t>
+          <w:numId w:val="2"/>
+        </w:numPr>
+      </w:pPr>
+      <w:r>
+        <w:rPr>
+          <w:rFonts w:ascii="Nunito" w:cs="Nunito" w:eastAsia="Nunito" w:hAnsi="Nunito"/>
+          <w:sz w:val="20"/>
+          <w:szCs w:val="20"/>
+        </w:rPr>
+        <w:t xml:space="preserve">Integration von Blockchain-SDK für Wallet-Verwaltung und Transaktionsabwicklung</w:t>
       </w:r>
     </w:p>
     <w:p>
@@ -1900,7 +2227,7 @@
           <w:sz w:val="18"/>
           <w:szCs w:val="18"/>
         </w:rPr>
-        <w:t xml:space="preserve">Stellar, Angular, Java, Python</w:t>
+        <w:t xml:space="preserve">Blockchain, Angular, Java, Python</w:t>
       </w:r>
     </w:p>
     <w:p>
@@ -1908,7 +2235,7 @@
         <w:pStyle w:val="ProjectTitle"/>
       </w:pPr>
       <w:r>
-        <w:t xml:space="preserve">Obsidian – Embedded OS &amp; Treiber für PLC2</w:t>
+        <w:t xml:space="preserve">Obsidian – Embedded OS &amp; Treiber</w:t>
       </w:r>
     </w:p>
     <w:p>
@@ -1934,7 +2261,7 @@
         <w:pStyle w:val="ListParagraph"/>
         <w:numPr>
           <w:ilvl w:val="0"/>
-          <w:numId w:val="3"/>
+          <w:numId w:val="2"/>
         </w:numPr>
       </w:pPr>
       <w:r>
@@ -1951,7 +2278,7 @@
         <w:pStyle w:val="ListParagraph"/>
         <w:numPr>
           <w:ilvl w:val="0"/>
-          <w:numId w:val="3"/>
+          <w:numId w:val="2"/>
         </w:numPr>
       </w:pPr>
       <w:r>
@@ -1968,7 +2295,7 @@
         <w:pStyle w:val="ListParagraph"/>
         <w:numPr>
           <w:ilvl w:val="0"/>
-          <w:numId w:val="3"/>
+          <w:numId w:val="2"/>
         </w:numPr>
       </w:pPr>
       <w:r>
@@ -2036,7 +2363,7 @@
         <w:pStyle w:val="ListParagraph"/>
         <w:numPr>
           <w:ilvl w:val="0"/>
-          <w:numId w:val="3"/>
+          <w:numId w:val="2"/>
         </w:numPr>
       </w:pPr>
       <w:r>
@@ -2053,7 +2380,7 @@
         <w:pStyle w:val="ListParagraph"/>
         <w:numPr>
           <w:ilvl w:val="0"/>
-          <w:numId w:val="3"/>
+          <w:numId w:val="2"/>
         </w:numPr>
       </w:pPr>
       <w:r>
@@ -2070,7 +2397,7 @@
         <w:pStyle w:val="ListParagraph"/>
         <w:numPr>
           <w:ilvl w:val="0"/>
-          <w:numId w:val="3"/>
+          <w:numId w:val="2"/>
         </w:numPr>
       </w:pPr>
       <w:r>
@@ -2087,7 +2414,7 @@
         <w:pStyle w:val="ListParagraph"/>
         <w:numPr>
           <w:ilvl w:val="0"/>
-          <w:numId w:val="3"/>
+          <w:numId w:val="2"/>
         </w:numPr>
       </w:pPr>
       <w:r>
@@ -2155,7 +2482,7 @@
         <w:pStyle w:val="ListParagraph"/>
         <w:numPr>
           <w:ilvl w:val="0"/>
-          <w:numId w:val="3"/>
+          <w:numId w:val="2"/>
         </w:numPr>
       </w:pPr>
       <w:r>
@@ -2172,7 +2499,7 @@
         <w:pStyle w:val="ListParagraph"/>
         <w:numPr>
           <w:ilvl w:val="0"/>
-          <w:numId w:val="3"/>
+          <w:numId w:val="2"/>
         </w:numPr>
       </w:pPr>
       <w:r>
@@ -2189,7 +2516,7 @@
         <w:pStyle w:val="ListParagraph"/>
         <w:numPr>
           <w:ilvl w:val="0"/>
-          <w:numId w:val="3"/>
+          <w:numId w:val="2"/>
         </w:numPr>
       </w:pPr>
       <w:r>
@@ -2199,6 +2526,23 @@
           <w:szCs w:val="20"/>
         </w:rPr>
         <w:t xml:space="preserve">Optimierung des Energieverbrauchs für dauerhaftes BLE-Scanning im Hintergrund</w:t>
+      </w:r>
+    </w:p>
+    <w:p>
+      <w:pPr>
+        <w:pStyle w:val="ListParagraph"/>
+        <w:numPr>
+          <w:ilvl w:val="0"/>
+          <w:numId w:val="2"/>
+        </w:numPr>
+      </w:pPr>
+      <w:r>
+        <w:rPr>
+          <w:rFonts w:ascii="Nunito" w:cs="Nunito" w:eastAsia="Nunito" w:hAnsi="Nunito"/>
+          <w:sz w:val="20"/>
+          <w:szCs w:val="20"/>
+        </w:rPr>
+        <w:t xml:space="preserve">Anbindung an externe Systeme für erweiterte Alarmierungs- und Monitoring-Funktionen</w:t>
       </w:r>
     </w:p>
     <w:p>
@@ -2257,7 +2601,7 @@
         <w:pStyle w:val="ListParagraph"/>
         <w:numPr>
           <w:ilvl w:val="0"/>
-          <w:numId w:val="3"/>
+          <w:numId w:val="2"/>
         </w:numPr>
       </w:pPr>
       <w:r>
@@ -2274,7 +2618,7 @@
         <w:pStyle w:val="ListParagraph"/>
         <w:numPr>
           <w:ilvl w:val="0"/>
-          <w:numId w:val="3"/>
+          <w:numId w:val="2"/>
         </w:numPr>
       </w:pPr>
       <w:r>
@@ -2324,68 +2668,51 @@
         <w:pStyle w:val="CompanyRole"/>
       </w:pPr>
       <w:r>
-        <w:t xml:space="preserve">Eigenes Startup | Gründer &amp; Entwickler | 03/2013 – 12/2014</w:t>
-      </w:r>
-    </w:p>
-    <w:p>
-      <w:r>
-        <w:rPr>
-          <w:rFonts w:ascii="Nunito" w:cs="Nunito" w:eastAsia="Nunito" w:hAnsi="Nunito"/>
-          <w:sz w:val="20"/>
-          <w:szCs w:val="20"/>
-        </w:rPr>
-        <w:t xml:space="preserve">Gründung und technische Entwicklung eines Smart-Home-Systems mit selbst entwickeltem Gateway und integrierter Hausautomatisierung.</w:t>
-      </w:r>
-    </w:p>
-    <w:p>
-      <w:pPr>
-        <w:pStyle w:val="ListParagraph"/>
-        <w:numPr>
-          <w:ilvl w:val="0"/>
-          <w:numId w:val="3"/>
-        </w:numPr>
-      </w:pPr>
-      <w:r>
-        <w:rPr>
-          <w:rFonts w:ascii="Nunito" w:cs="Nunito" w:eastAsia="Nunito" w:hAnsi="Nunito"/>
-          <w:sz w:val="20"/>
-          <w:szCs w:val="20"/>
-        </w:rPr>
-        <w:t xml:space="preserve">Eigenentwickeltes Embedded-Linux-Gateway (Yocto) mit Multi-Protokoll-Unterstützung</w:t>
-      </w:r>
-    </w:p>
-    <w:p>
-      <w:pPr>
-        <w:pStyle w:val="ListParagraph"/>
-        <w:numPr>
-          <w:ilvl w:val="0"/>
-          <w:numId w:val="3"/>
-        </w:numPr>
-      </w:pPr>
-      <w:r>
-        <w:rPr>
-          <w:rFonts w:ascii="Nunito" w:cs="Nunito" w:eastAsia="Nunito" w:hAnsi="Nunito"/>
-          <w:sz w:val="20"/>
-          <w:szCs w:val="20"/>
-        </w:rPr>
-        <w:t xml:space="preserve">Gewinner: Baden-Württemberg Goes Mobile 2014 (Kategorie: Mobile Housemate 2.0)</w:t>
-      </w:r>
-    </w:p>
-    <w:p>
-      <w:pPr>
-        <w:pStyle w:val="ListParagraph"/>
-        <w:numPr>
-          <w:ilvl w:val="0"/>
-          <w:numId w:val="3"/>
-        </w:numPr>
-      </w:pPr>
-      <w:r>
-        <w:rPr>
-          <w:rFonts w:ascii="Nunito" w:cs="Nunito" w:eastAsia="Nunito" w:hAnsi="Nunito"/>
-          <w:sz w:val="20"/>
-          <w:szCs w:val="20"/>
-        </w:rPr>
-        <w:t xml:space="preserve">Gewinner: Regional Cup Elevator Pitch Baden-Württemberg 2013 (Südschwarzwald)</w:t>
+        <w:t xml:space="preserve">Eigenes Startup | Co-Gründer | 03/2013 – 12/2014</w:t>
+      </w:r>
+    </w:p>
+    <w:p>
+      <w:r>
+        <w:rPr>
+          <w:rFonts w:ascii="Nunito" w:cs="Nunito" w:eastAsia="Nunito" w:hAnsi="Nunito"/>
+          <w:sz w:val="20"/>
+          <w:szCs w:val="20"/>
+        </w:rPr>
+        <w:t xml:space="preserve">Mitgründung und technische Leitung eines Smart-Home-Startups mit eigenem Gateway und integrierter Hausautomatisierung.</w:t>
+      </w:r>
+    </w:p>
+    <w:p>
+      <w:pPr>
+        <w:pStyle w:val="ListParagraph"/>
+        <w:numPr>
+          <w:ilvl w:val="0"/>
+          <w:numId w:val="2"/>
+        </w:numPr>
+      </w:pPr>
+      <w:r>
+        <w:rPr>
+          <w:rFonts w:ascii="Nunito" w:cs="Nunito" w:eastAsia="Nunito" w:hAnsi="Nunito"/>
+          <w:sz w:val="20"/>
+          <w:szCs w:val="20"/>
+        </w:rPr>
+        <w:t xml:space="preserve">Eigenentwickeltes Embedded-Linux-Gateway (Yocto) mit Multi-Protokoll-Unterstützung (Z-Wave, EnOcean, DigitalSTROM, M-Bus, HomeMatic, ZigBee)</w:t>
+      </w:r>
+    </w:p>
+    <w:p>
+      <w:pPr>
+        <w:pStyle w:val="ListParagraph"/>
+        <w:numPr>
+          <w:ilvl w:val="0"/>
+          <w:numId w:val="2"/>
+        </w:numPr>
+      </w:pPr>
+      <w:r>
+        <w:rPr>
+          <w:rFonts w:ascii="Nunito" w:cs="Nunito" w:eastAsia="Nunito" w:hAnsi="Nunito"/>
+          <w:sz w:val="20"/>
+          <w:szCs w:val="20"/>
+        </w:rPr>
+        <w:t xml:space="preserve">Entwicklung der Backend-Infrastruktur und Cloud-Anbindung</w:t>
       </w:r>
     </w:p>
     <w:p>
@@ -2436,41 +2763,58 @@
           <w:sz w:val="20"/>
           <w:szCs w:val="20"/>
         </w:rPr>
-        <w:t xml:space="preserve">Integration des EnOcean-Funkprotokolls in den DigitalSTROM-Server für erweiterte Sensorunterstützung.</w:t>
-      </w:r>
-    </w:p>
-    <w:p>
-      <w:pPr>
-        <w:pStyle w:val="ListParagraph"/>
-        <w:numPr>
-          <w:ilvl w:val="0"/>
-          <w:numId w:val="3"/>
-        </w:numPr>
-      </w:pPr>
-      <w:r>
-        <w:rPr>
-          <w:rFonts w:ascii="Nunito" w:cs="Nunito" w:eastAsia="Nunito" w:hAnsi="Nunito"/>
-          <w:sz w:val="20"/>
-          <w:szCs w:val="20"/>
-        </w:rPr>
-        <w:t xml:space="preserve">Entwicklung von Treibern für EnOcean-Sensoren (Temperatur, Bewegung, Fensterkontakte)</w:t>
-      </w:r>
-    </w:p>
-    <w:p>
-      <w:pPr>
-        <w:pStyle w:val="ListParagraph"/>
-        <w:numPr>
-          <w:ilvl w:val="0"/>
-          <w:numId w:val="3"/>
-        </w:numPr>
-      </w:pPr>
-      <w:r>
-        <w:rPr>
-          <w:rFonts w:ascii="Nunito" w:cs="Nunito" w:eastAsia="Nunito" w:hAnsi="Nunito"/>
-          <w:sz w:val="20"/>
-          <w:szCs w:val="20"/>
-        </w:rPr>
-        <w:t xml:space="preserve">Integration in die bestehende DigitalSTROM-Server-Architektur (C++/Python)</w:t>
+        <w:t xml:space="preserve">Integration des EnOcean-Funkprotokolls in das DigitalSTROM-Ökosystem als Wrapper für virtuelle DigitalSTROM-Geräte.</w:t>
+      </w:r>
+    </w:p>
+    <w:p>
+      <w:pPr>
+        <w:pStyle w:val="ListParagraph"/>
+        <w:numPr>
+          <w:ilvl w:val="0"/>
+          <w:numId w:val="2"/>
+        </w:numPr>
+      </w:pPr>
+      <w:r>
+        <w:rPr>
+          <w:rFonts w:ascii="Nunito" w:cs="Nunito" w:eastAsia="Nunito" w:hAnsi="Nunito"/>
+          <w:sz w:val="20"/>
+          <w:szCs w:val="20"/>
+        </w:rPr>
+        <w:t xml:space="preserve">Protokoll-Integration: EnOcean-Sensoren als virtuelle DigitalSTROM-Geräte abgebildet</w:t>
+      </w:r>
+    </w:p>
+    <w:p>
+      <w:pPr>
+        <w:pStyle w:val="ListParagraph"/>
+        <w:numPr>
+          <w:ilvl w:val="0"/>
+          <w:numId w:val="2"/>
+        </w:numPr>
+      </w:pPr>
+      <w:r>
+        <w:rPr>
+          <w:rFonts w:ascii="Nunito" w:cs="Nunito" w:eastAsia="Nunito" w:hAnsi="Nunito"/>
+          <w:sz w:val="20"/>
+          <w:szCs w:val="20"/>
+        </w:rPr>
+        <w:t xml:space="preserve">Entwicklung eines virtuellen DSM (DigitalSTROM-Meter) zur Einbindung der EnOcean-Geräte ins DigitalSTROM-System</w:t>
+      </w:r>
+    </w:p>
+    <w:p>
+      <w:pPr>
+        <w:pStyle w:val="ListParagraph"/>
+        <w:numPr>
+          <w:ilvl w:val="0"/>
+          <w:numId w:val="2"/>
+        </w:numPr>
+      </w:pPr>
+      <w:r>
+        <w:rPr>
+          <w:rFonts w:ascii="Nunito" w:cs="Nunito" w:eastAsia="Nunito" w:hAnsi="Nunito"/>
+          <w:sz w:val="20"/>
+          <w:szCs w:val="20"/>
+        </w:rPr>
+        <w:t xml:space="preserve">Eigenständige Web-UI für Konfiguration und Verwaltung der EnOcean-Geräte</w:t>
       </w:r>
     </w:p>
     <w:p>
@@ -2495,7 +2839,7 @@
           <w:sz w:val="18"/>
           <w:szCs w:val="18"/>
         </w:rPr>
-        <w:t xml:space="preserve">C++, Python, EnOcean, DigitalSTROM</w:t>
+        <w:t xml:space="preserve">C++, Python, JavaScript, HTML, EnOcean, DigitalSTROM</w:t>
       </w:r>
     </w:p>
     <w:p>
@@ -2664,7 +3008,7 @@
                 <w:sz w:val="20"/>
                 <w:szCs w:val="20"/>
               </w:rPr>
-              <w:t xml:space="preserve">2017</w:t>
+              <w:t xml:space="preserve">2015 – 2017</w:t>
             </w:r>
           </w:p>
         </w:tc>
@@ -2685,7 +3029,7 @@
                 <w:b/>
                 <w:bCs/>
               </w:rPr>
-              <w:t xml:space="preserve">Dozent – Internet of Things</w:t>
+              <w:t xml:space="preserve">Akademischer Mitarbeiter &amp; Dozent (Teilzeit)</w:t>
             </w:r>
           </w:p>
           <w:p>
@@ -2696,7 +3040,7 @@
                 <w:sz w:val="20"/>
                 <w:szCs w:val="20"/>
               </w:rPr>
-              <w:t xml:space="preserve">Hochschule Furtwangen, Masterstudiengänge</w:t>
+              <w:t xml:space="preserve">Hochschule Furtwangen</w:t>
             </w:r>
           </w:p>
         </w:tc>
@@ -2722,7 +3066,7 @@
                 <w:sz w:val="20"/>
                 <w:szCs w:val="20"/>
               </w:rPr>
-              <w:t xml:space="preserve">2015 – 2016</w:t>
+              <w:t xml:space="preserve">2010</w:t>
             </w:r>
           </w:p>
         </w:tc>
@@ -2743,7 +3087,7 @@
                 <w:b/>
                 <w:bCs/>
               </w:rPr>
-              <w:t xml:space="preserve">Akademischer Mitarbeiter (Promotion)</w:t>
+              <w:t xml:space="preserve">Softwareentwickler Praktikant</w:t>
             </w:r>
           </w:p>
           <w:p>
@@ -2754,7 +3098,7 @@
                 <w:sz w:val="20"/>
                 <w:szCs w:val="20"/>
               </w:rPr>
-              <w:t xml:space="preserve">Hochschule Furtwangen (Teilzeit)</w:t>
+              <w:t xml:space="preserve">Volkswagen de México</w:t>
             </w:r>
           </w:p>
         </w:tc>
@@ -2780,7 +3124,7 @@
                 <w:sz w:val="20"/>
                 <w:szCs w:val="20"/>
               </w:rPr>
-              <w:t xml:space="preserve">2010</w:t>
+              <w:t xml:space="preserve">2009 – 2012</w:t>
             </w:r>
           </w:p>
         </w:tc>
@@ -2801,7 +3145,7 @@
                 <w:b/>
                 <w:bCs/>
               </w:rPr>
-              <w:t xml:space="preserve">Softwareentwickler Praktikant</w:t>
+              <w:t xml:space="preserve">Netzwerkadministrator (ehrenamtlich)</w:t>
             </w:r>
           </w:p>
           <w:p>
@@ -2812,7 +3156,65 @@
                 <w:sz w:val="20"/>
                 <w:szCs w:val="20"/>
               </w:rPr>
-              <w:t xml:space="preserve">Volkswagen de México</w:t>
+              <w:t xml:space="preserve">Studentenwerk Freiburg, Furtwangen</w:t>
+            </w:r>
+          </w:p>
+        </w:tc>
+      </w:tr>
+      <w:tr>
+        <w:tc>
+          <w:tcPr>
+            <w:tcW w:type="dxa" w:w="2000"/>
+            <w:tcBorders>
+              <w:top w:val="none" w:color="FFFFFF" w:sz="0"/>
+              <w:left w:val="none" w:color="FFFFFF" w:sz="0"/>
+              <w:bottom w:val="none" w:color="FFFFFF" w:sz="0"/>
+              <w:right w:val="none" w:color="FFFFFF" w:sz="0"/>
+            </w:tcBorders>
+          </w:tcPr>
+          <w:p>
+            <w:r>
+              <w:rPr>
+                <w:rFonts w:ascii="Nunito" w:cs="Nunito" w:eastAsia="Nunito" w:hAnsi="Nunito"/>
+                <w:b/>
+                <w:bCs/>
+                <w:color w:val="1E3A5F"/>
+                <w:sz w:val="20"/>
+                <w:szCs w:val="20"/>
+              </w:rPr>
+              <w:t xml:space="preserve">2009 – 2010</w:t>
+            </w:r>
+          </w:p>
+        </w:tc>
+        <w:tc>
+          <w:tcPr>
+            <w:tcW w:type="dxa" w:w="8000"/>
+            <w:tcBorders>
+              <w:top w:val="none" w:color="FFFFFF" w:sz="0"/>
+              <w:left w:val="none" w:color="FFFFFF" w:sz="0"/>
+              <w:bottom w:val="none" w:color="FFFFFF" w:sz="0"/>
+              <w:right w:val="none" w:color="FFFFFF" w:sz="0"/>
+            </w:tcBorders>
+          </w:tcPr>
+          <w:p>
+            <w:r>
+              <w:rPr>
+                <w:rFonts w:ascii="Nunito" w:cs="Nunito" w:eastAsia="Nunito" w:hAnsi="Nunito"/>
+                <w:b/>
+                <w:bCs/>
+              </w:rPr>
+              <w:t xml:space="preserve">Softwareentwickler (studentische Hilfskraft)</w:t>
+            </w:r>
+          </w:p>
+          <w:p>
+            <w:r>
+              <w:rPr>
+                <w:rFonts w:ascii="Nunito" w:cs="Nunito" w:eastAsia="Nunito" w:hAnsi="Nunito"/>
+                <w:color w:val="D0520F"/>
+                <w:sz w:val="20"/>
+                <w:szCs w:val="20"/>
+              </w:rPr>
+              <w:t xml:space="preserve">IT-Rechenzentrum Furtwangen</w:t>
             </w:r>
           </w:p>
         </w:tc>
@@ -2884,14 +3286,14 @@
                 <w:b/>
                 <w:bCs/>
               </w:rPr>
-              <w:t xml:space="preserve">Master of Science – Informatik (Note: 1,0)</w:t>
-            </w:r>
-          </w:p>
-          <w:p>
-            <w:r>
-              <w:rPr>
-                <w:rFonts w:ascii="Nunito" w:cs="Nunito" w:eastAsia="Nunito" w:hAnsi="Nunito"/>
-                <w:color w:val="666666"/>
+              <w:t xml:space="preserve">Master of Science – Informatik</w:t>
+            </w:r>
+          </w:p>
+          <w:p>
+            <w:r>
+              <w:rPr>
+                <w:rFonts w:ascii="Nunito" w:cs="Nunito" w:eastAsia="Nunito" w:hAnsi="Nunito"/>
+                <w:color w:val="D0520F"/>
                 <w:sz w:val="20"/>
                 <w:szCs w:val="20"/>
               </w:rPr>
@@ -2908,7 +3310,7 @@
                 <w:sz w:val="18"/>
                 <w:szCs w:val="18"/>
               </w:rPr>
-              <w:t xml:space="preserve">Thesis: Koordination und Kombination heterogener Technologien im Kontext von Smart Home</w:t>
+              <w:t xml:space="preserve">Thesis: Koordination und Kombination heterogener Technologien im Kontext von Smart Home (Note: 1,0)</w:t>
             </w:r>
           </w:p>
         </w:tc>
@@ -2955,14 +3357,14 @@
                 <w:b/>
                 <w:bCs/>
               </w:rPr>
-              <w:t xml:space="preserve">Bachelor of Science – Informatik (Note: 1,3)</w:t>
-            </w:r>
-          </w:p>
-          <w:p>
-            <w:r>
-              <w:rPr>
-                <w:rFonts w:ascii="Nunito" w:cs="Nunito" w:eastAsia="Nunito" w:hAnsi="Nunito"/>
-                <w:color w:val="666666"/>
+              <w:t xml:space="preserve">Bachelor of Science – Informatik</w:t>
+            </w:r>
+          </w:p>
+          <w:p>
+            <w:r>
+              <w:rPr>
+                <w:rFonts w:ascii="Nunito" w:cs="Nunito" w:eastAsia="Nunito" w:hAnsi="Nunito"/>
+                <w:color w:val="D0520F"/>
                 <w:sz w:val="20"/>
                 <w:szCs w:val="20"/>
               </w:rPr>
@@ -2979,7 +3381,7 @@
                 <w:sz w:val="18"/>
                 <w:szCs w:val="18"/>
               </w:rPr>
-              <w:t xml:space="preserve">Thesis: Homogenisierung von Gebäudeautomatisierung über TCP/IP</w:t>
+              <w:t xml:space="preserve">Thesis: Homogenisierung von Gebäudeautomatisierung über TCP/IP (Note: 1,3)</w:t>
             </w:r>
           </w:p>
         </w:tc>
@@ -2993,68 +3395,9 @@
         <w:t xml:space="preserve">Zertifikate &amp; Publikationen</w:t>
       </w:r>
     </w:p>
-    <w:p>
-      <w:pPr>
-        <w:pStyle w:val="ListParagraph"/>
-        <w:numPr>
-          <w:ilvl w:val="0"/>
-          <w:numId w:val="2"/>
-        </w:numPr>
-      </w:pPr>
-      <w:r>
-        <w:rPr>
-          <w:rFonts w:ascii="Nunito" w:cs="Nunito" w:eastAsia="Nunito" w:hAnsi="Nunito"/>
-          <w:b/>
-          <w:bCs/>
-        </w:rPr>
-        <w:t xml:space="preserve">ITIL Version 2 Foundation Examination</w:t>
-      </w:r>
-      <w:r>
-        <w:rPr>
-          <w:rFonts w:ascii="Nunito" w:cs="Nunito" w:eastAsia="Nunito" w:hAnsi="Nunito"/>
-          <w:color w:val="666666"/>
-        </w:rPr>
-        <w:t xml:space="preserve"> (2010)</w:t>
-      </w:r>
-    </w:p>
-    <w:p>
-      <w:pPr>
-        <w:pStyle w:val="ListParagraph"/>
-        <w:numPr>
-          <w:ilvl w:val="0"/>
-          <w:numId w:val="2"/>
-        </w:numPr>
-      </w:pPr>
-      <w:r>
-        <w:rPr>
-          <w:rFonts w:ascii="Nunito" w:cs="Nunito" w:eastAsia="Nunito" w:hAnsi="Nunito"/>
-          <w:b/>
-          <w:bCs/>
-        </w:rPr>
-        <w:t xml:space="preserve">Peer-reviewed Publikation: </w:t>
-      </w:r>
-      <w:r>
-        <w:rPr>
-          <w:rFonts w:ascii="Nunito" w:cs="Nunito" w:eastAsia="Nunito" w:hAnsi="Nunito"/>
-          <w:i/>
-          <w:iCs/>
-          <w:sz w:val="20"/>
-          <w:szCs w:val="20"/>
-        </w:rPr>
-        <w:t xml:space="preserve">"Untersuchung des Peer-to-Peer Web-Standards WebRTC" – InformatikJournal 2013</w:t>
-      </w:r>
-    </w:p>
-    <w:p>
-      <w:pPr>
-        <w:pStyle w:val="SectionHeader"/>
-      </w:pPr>
-      <w:r>
-        <w:t xml:space="preserve">Technische Fähigkeiten</w:t>
-      </w:r>
-    </w:p>
     <w:tbl>
       <w:tblPr>
-        <w:tblW w:type="pct" w:w="100%"/>
+        <w:tblW w:type="auto" w:w="100"/>
         <w:tblBorders>
           <w:top w:val="single" w:color="auto" w:sz="4"/>
           <w:left w:val="single" w:color="auto" w:sz="4"/>
@@ -3065,24 +3408,21 @@
         </w:tblBorders>
       </w:tblPr>
       <w:tblGrid>
-        <w:gridCol w:w="2800"/>
-        <w:gridCol w:w="7200"/>
+        <w:gridCol w:w="2000"/>
+        <w:gridCol w:w="8000"/>
       </w:tblGrid>
       <w:tr>
         <w:tc>
           <w:tcPr>
-            <w:tcW w:type="dxa" w:w="2800"/>
-            <w:tcBorders>
-              <w:top w:val="none" w:color="FFFFFF" w:sz="0"/>
-              <w:left w:val="none" w:color="FFFFFF" w:sz="0"/>
-              <w:bottom w:val="none" w:color="FFFFFF" w:sz="0"/>
-              <w:right w:val="none" w:color="FFFFFF" w:sz="0"/>
-            </w:tcBorders>
-          </w:tcPr>
-          <w:p>
-            <w:pPr>
-              <w:spacing w:before="40" w:after="40"/>
-            </w:pPr>
+            <w:tcW w:type="dxa" w:w="2000"/>
+            <w:tcBorders>
+              <w:top w:val="none" w:color="FFFFFF" w:sz="0"/>
+              <w:left w:val="none" w:color="FFFFFF" w:sz="0"/>
+              <w:bottom w:val="none" w:color="FFFFFF" w:sz="0"/>
+              <w:right w:val="none" w:color="FFFFFF" w:sz="0"/>
+            </w:tcBorders>
+          </w:tcPr>
+          <w:p>
             <w:r>
               <w:rPr>
                 <w:rFonts w:ascii="Nunito" w:cs="Nunito" w:eastAsia="Nunito" w:hAnsi="Nunito"/>
@@ -3092,31 +3432,39 @@
                 <w:sz w:val="20"/>
                 <w:szCs w:val="20"/>
               </w:rPr>
-              <w:t xml:space="preserve">Programmierung</w:t>
-            </w:r>
-          </w:p>
-        </w:tc>
-        <w:tc>
-          <w:tcPr>
-            <w:tcW w:type="dxa" w:w="7200"/>
-            <w:tcBorders>
-              <w:top w:val="none" w:color="FFFFFF" w:sz="0"/>
-              <w:left w:val="none" w:color="FFFFFF" w:sz="0"/>
-              <w:bottom w:val="none" w:color="FFFFFF" w:sz="0"/>
-              <w:right w:val="none" w:color="FFFFFF" w:sz="0"/>
-            </w:tcBorders>
-          </w:tcPr>
-          <w:p>
-            <w:pPr>
-              <w:spacing w:before="40" w:after="40"/>
-            </w:pPr>
-            <w:r>
-              <w:rPr>
-                <w:rFonts w:ascii="Nunito" w:cs="Nunito" w:eastAsia="Nunito" w:hAnsi="Nunito"/>
-                <w:sz w:val="20"/>
-                <w:szCs w:val="20"/>
-              </w:rPr>
-              <w:t xml:space="preserve">Java, Python, C, TypeScript/JavaScript, C++, Bash</w:t>
+              <w:t xml:space="preserve">2013</w:t>
+            </w:r>
+          </w:p>
+        </w:tc>
+        <w:tc>
+          <w:tcPr>
+            <w:tcW w:type="dxa" w:w="8000"/>
+            <w:tcBorders>
+              <w:top w:val="none" w:color="FFFFFF" w:sz="0"/>
+              <w:left w:val="none" w:color="FFFFFF" w:sz="0"/>
+              <w:bottom w:val="none" w:color="FFFFFF" w:sz="0"/>
+              <w:right w:val="none" w:color="FFFFFF" w:sz="0"/>
+            </w:tcBorders>
+          </w:tcPr>
+          <w:p>
+            <w:r>
+              <w:rPr>
+                <w:rFonts w:ascii="Nunito" w:cs="Nunito" w:eastAsia="Nunito" w:hAnsi="Nunito"/>
+                <w:b/>
+                <w:bCs/>
+              </w:rPr>
+              <w:t xml:space="preserve">Peer-reviewed Publikation – Untersuchung des Peer-to-Peer Web-Standards WebRTC</w:t>
+            </w:r>
+          </w:p>
+          <w:p>
+            <w:r>
+              <w:rPr>
+                <w:rFonts w:ascii="Nunito" w:cs="Nunito" w:eastAsia="Nunito" w:hAnsi="Nunito"/>
+                <w:color w:val="666666"/>
+                <w:sz w:val="20"/>
+                <w:szCs w:val="20"/>
+              </w:rPr>
+              <w:t xml:space="preserve">InformatikJournal (2013), Hochschule Furtwangen, pp. 23-32. ISBN: 978-3-00-0443221-3</w:t>
             </w:r>
           </w:p>
         </w:tc>
@@ -3124,19 +3472,15 @@
       <w:tr>
         <w:tc>
           <w:tcPr>
-            <w:tcW w:type="dxa" w:w="2800"/>
-            <w:tcBorders>
-              <w:top w:val="none" w:color="FFFFFF" w:sz="0"/>
-              <w:left w:val="none" w:color="FFFFFF" w:sz="0"/>
-              <w:bottom w:val="none" w:color="FFFFFF" w:sz="0"/>
-              <w:right w:val="none" w:color="FFFFFF" w:sz="0"/>
-            </w:tcBorders>
-            <w:shd w:fill="F5F5F5" w:val="clear"/>
-          </w:tcPr>
-          <w:p>
-            <w:pPr>
-              <w:spacing w:before="40" w:after="40"/>
-            </w:pPr>
+            <w:tcW w:type="dxa" w:w="2000"/>
+            <w:tcBorders>
+              <w:top w:val="none" w:color="FFFFFF" w:sz="0"/>
+              <w:left w:val="none" w:color="FFFFFF" w:sz="0"/>
+              <w:bottom w:val="none" w:color="FFFFFF" w:sz="0"/>
+              <w:right w:val="none" w:color="FFFFFF" w:sz="0"/>
+            </w:tcBorders>
+          </w:tcPr>
+          <w:p>
             <w:r>
               <w:rPr>
                 <w:rFonts w:ascii="Nunito" w:cs="Nunito" w:eastAsia="Nunito" w:hAnsi="Nunito"/>
@@ -3146,51 +3490,69 @@
                 <w:sz w:val="20"/>
                 <w:szCs w:val="20"/>
               </w:rPr>
-              <w:t xml:space="preserve">Frameworks</w:t>
-            </w:r>
-          </w:p>
-        </w:tc>
-        <w:tc>
-          <w:tcPr>
-            <w:tcW w:type="dxa" w:w="7200"/>
-            <w:tcBorders>
-              <w:top w:val="none" w:color="FFFFFF" w:sz="0"/>
-              <w:left w:val="none" w:color="FFFFFF" w:sz="0"/>
-              <w:bottom w:val="none" w:color="FFFFFF" w:sz="0"/>
-              <w:right w:val="none" w:color="FFFFFF" w:sz="0"/>
-            </w:tcBorders>
-            <w:shd w:fill="F5F5F5" w:val="clear"/>
-          </w:tcPr>
-          <w:p>
-            <w:pPr>
-              <w:spacing w:before="40" w:after="40"/>
-            </w:pPr>
-            <w:r>
-              <w:rPr>
-                <w:rFonts w:ascii="Nunito" w:cs="Nunito" w:eastAsia="Nunito" w:hAnsi="Nunito"/>
-                <w:sz w:val="20"/>
-                <w:szCs w:val="20"/>
-              </w:rPr>
-              <w:t xml:space="preserve">Spring Boot, Angular, Flask, OSGi, Hibernate, JUnit, JPA</w:t>
+              <w:t xml:space="preserve">2010</w:t>
+            </w:r>
+          </w:p>
+        </w:tc>
+        <w:tc>
+          <w:tcPr>
+            <w:tcW w:type="dxa" w:w="8000"/>
+            <w:tcBorders>
+              <w:top w:val="none" w:color="FFFFFF" w:sz="0"/>
+              <w:left w:val="none" w:color="FFFFFF" w:sz="0"/>
+              <w:bottom w:val="none" w:color="FFFFFF" w:sz="0"/>
+              <w:right w:val="none" w:color="FFFFFF" w:sz="0"/>
+            </w:tcBorders>
+          </w:tcPr>
+          <w:p>
+            <w:r>
+              <w:rPr>
+                <w:rFonts w:ascii="Nunito" w:cs="Nunito" w:eastAsia="Nunito" w:hAnsi="Nunito"/>
+                <w:b/>
+                <w:bCs/>
+              </w:rPr>
+              <w:t xml:space="preserve">ITIL Version 2 Foundation Examination</w:t>
             </w:r>
           </w:p>
         </w:tc>
       </w:tr>
+    </w:tbl>
+    <w:p>
+      <w:pPr>
+        <w:pStyle w:val="SectionHeader"/>
+      </w:pPr>
+      <w:r>
+        <w:t xml:space="preserve">Auszeichnungen</w:t>
+      </w:r>
+    </w:p>
+    <w:tbl>
+      <w:tblPr>
+        <w:tblW w:type="auto" w:w="100"/>
+        <w:tblBorders>
+          <w:top w:val="single" w:color="auto" w:sz="4"/>
+          <w:left w:val="single" w:color="auto" w:sz="4"/>
+          <w:bottom w:val="single" w:color="auto" w:sz="4"/>
+          <w:right w:val="single" w:color="auto" w:sz="4"/>
+          <w:insideH w:val="single" w:color="auto" w:sz="4"/>
+          <w:insideV w:val="single" w:color="auto" w:sz="4"/>
+        </w:tblBorders>
+      </w:tblPr>
+      <w:tblGrid>
+        <w:gridCol w:w="2000"/>
+        <w:gridCol w:w="8000"/>
+      </w:tblGrid>
       <w:tr>
         <w:tc>
           <w:tcPr>
-            <w:tcW w:type="dxa" w:w="2800"/>
-            <w:tcBorders>
-              <w:top w:val="none" w:color="FFFFFF" w:sz="0"/>
-              <w:left w:val="none" w:color="FFFFFF" w:sz="0"/>
-              <w:bottom w:val="none" w:color="FFFFFF" w:sz="0"/>
-              <w:right w:val="none" w:color="FFFFFF" w:sz="0"/>
-            </w:tcBorders>
-          </w:tcPr>
-          <w:p>
-            <w:pPr>
-              <w:spacing w:before="40" w:after="40"/>
-            </w:pPr>
+            <w:tcW w:type="dxa" w:w="2000"/>
+            <w:tcBorders>
+              <w:top w:val="none" w:color="FFFFFF" w:sz="0"/>
+              <w:left w:val="none" w:color="FFFFFF" w:sz="0"/>
+              <w:bottom w:val="none" w:color="FFFFFF" w:sz="0"/>
+              <w:right w:val="none" w:color="FFFFFF" w:sz="0"/>
+            </w:tcBorders>
+          </w:tcPr>
+          <w:p>
             <w:r>
               <w:rPr>
                 <w:rFonts w:ascii="Nunito" w:cs="Nunito" w:eastAsia="Nunito" w:hAnsi="Nunito"/>
@@ -3200,31 +3562,39 @@
                 <w:sz w:val="20"/>
                 <w:szCs w:val="20"/>
               </w:rPr>
-              <w:t xml:space="preserve">Cloud &amp; Infrastruktur</w:t>
-            </w:r>
-          </w:p>
-        </w:tc>
-        <w:tc>
-          <w:tcPr>
-            <w:tcW w:type="dxa" w:w="7200"/>
-            <w:tcBorders>
-              <w:top w:val="none" w:color="FFFFFF" w:sz="0"/>
-              <w:left w:val="none" w:color="FFFFFF" w:sz="0"/>
-              <w:bottom w:val="none" w:color="FFFFFF" w:sz="0"/>
-              <w:right w:val="none" w:color="FFFFFF" w:sz="0"/>
-            </w:tcBorders>
-          </w:tcPr>
-          <w:p>
-            <w:pPr>
-              <w:spacing w:before="40" w:after="40"/>
-            </w:pPr>
-            <w:r>
-              <w:rPr>
-                <w:rFonts w:ascii="Nunito" w:cs="Nunito" w:eastAsia="Nunito" w:hAnsi="Nunito"/>
-                <w:sz w:val="20"/>
-                <w:szCs w:val="20"/>
-              </w:rPr>
-              <w:t xml:space="preserve">AWS, Docker, Kubernetes, Linux, Yocto/OpenEmbedded</w:t>
+              <w:t xml:space="preserve">2014</w:t>
+            </w:r>
+          </w:p>
+        </w:tc>
+        <w:tc>
+          <w:tcPr>
+            <w:tcW w:type="dxa" w:w="8000"/>
+            <w:tcBorders>
+              <w:top w:val="none" w:color="FFFFFF" w:sz="0"/>
+              <w:left w:val="none" w:color="FFFFFF" w:sz="0"/>
+              <w:bottom w:val="none" w:color="FFFFFF" w:sz="0"/>
+              <w:right w:val="none" w:color="FFFFFF" w:sz="0"/>
+            </w:tcBorders>
+          </w:tcPr>
+          <w:p>
+            <w:r>
+              <w:rPr>
+                <w:rFonts w:ascii="Nunito" w:cs="Nunito" w:eastAsia="Nunito" w:hAnsi="Nunito"/>
+                <w:b/>
+                <w:bCs/>
+              </w:rPr>
+              <w:t xml:space="preserve">Baden-Württemberg Goes Mobile – Gewinner</w:t>
+            </w:r>
+          </w:p>
+          <w:p>
+            <w:r>
+              <w:rPr>
+                <w:rFonts w:ascii="Nunito" w:cs="Nunito" w:eastAsia="Nunito" w:hAnsi="Nunito"/>
+                <w:color w:val="666666"/>
+                <w:sz w:val="20"/>
+                <w:szCs w:val="20"/>
+              </w:rPr>
+              <w:t xml:space="preserve">Kategorie: Mobile Housemate 2.0</w:t>
             </w:r>
           </w:p>
         </w:tc>
@@ -3232,19 +3602,15 @@
       <w:tr>
         <w:tc>
           <w:tcPr>
-            <w:tcW w:type="dxa" w:w="2800"/>
-            <w:tcBorders>
-              <w:top w:val="none" w:color="FFFFFF" w:sz="0"/>
-              <w:left w:val="none" w:color="FFFFFF" w:sz="0"/>
-              <w:bottom w:val="none" w:color="FFFFFF" w:sz="0"/>
-              <w:right w:val="none" w:color="FFFFFF" w:sz="0"/>
-            </w:tcBorders>
-            <w:shd w:fill="F5F5F5" w:val="clear"/>
-          </w:tcPr>
-          <w:p>
-            <w:pPr>
-              <w:spacing w:before="40" w:after="40"/>
-            </w:pPr>
+            <w:tcW w:type="dxa" w:w="2000"/>
+            <w:tcBorders>
+              <w:top w:val="none" w:color="FFFFFF" w:sz="0"/>
+              <w:left w:val="none" w:color="FFFFFF" w:sz="0"/>
+              <w:bottom w:val="none" w:color="FFFFFF" w:sz="0"/>
+              <w:right w:val="none" w:color="FFFFFF" w:sz="0"/>
+            </w:tcBorders>
+          </w:tcPr>
+          <w:p>
             <w:r>
               <w:rPr>
                 <w:rFonts w:ascii="Nunito" w:cs="Nunito" w:eastAsia="Nunito" w:hAnsi="Nunito"/>
@@ -3254,409 +3620,39 @@
                 <w:sz w:val="20"/>
                 <w:szCs w:val="20"/>
               </w:rPr>
-              <w:t xml:space="preserve">DevOps &amp; Tools</w:t>
-            </w:r>
-          </w:p>
-        </w:tc>
-        <w:tc>
-          <w:tcPr>
-            <w:tcW w:type="dxa" w:w="7200"/>
-            <w:tcBorders>
-              <w:top w:val="none" w:color="FFFFFF" w:sz="0"/>
-              <w:left w:val="none" w:color="FFFFFF" w:sz="0"/>
-              <w:bottom w:val="none" w:color="FFFFFF" w:sz="0"/>
-              <w:right w:val="none" w:color="FFFFFF" w:sz="0"/>
-            </w:tcBorders>
-            <w:shd w:fill="F5F5F5" w:val="clear"/>
-          </w:tcPr>
-          <w:p>
-            <w:pPr>
-              <w:spacing w:before="40" w:after="40"/>
-            </w:pPr>
-            <w:r>
-              <w:rPr>
-                <w:rFonts w:ascii="Nunito" w:cs="Nunito" w:eastAsia="Nunito" w:hAnsi="Nunito"/>
-                <w:sz w:val="20"/>
-                <w:szCs w:val="20"/>
-              </w:rPr>
-              <w:t xml:space="preserve">Git, Jenkins, CI/CD Pipelines, Atlassian Suite (Jira/Confluence)</w:t>
-            </w:r>
-          </w:p>
-        </w:tc>
-      </w:tr>
-      <w:tr>
-        <w:tc>
-          <w:tcPr>
-            <w:tcW w:type="dxa" w:w="2800"/>
-            <w:tcBorders>
-              <w:top w:val="none" w:color="FFFFFF" w:sz="0"/>
-              <w:left w:val="none" w:color="FFFFFF" w:sz="0"/>
-              <w:bottom w:val="none" w:color="FFFFFF" w:sz="0"/>
-              <w:right w:val="none" w:color="FFFFFF" w:sz="0"/>
-            </w:tcBorders>
-          </w:tcPr>
-          <w:p>
-            <w:pPr>
-              <w:spacing w:before="40" w:after="40"/>
-            </w:pPr>
+              <w:t xml:space="preserve">2013</w:t>
+            </w:r>
+          </w:p>
+        </w:tc>
+        <w:tc>
+          <w:tcPr>
+            <w:tcW w:type="dxa" w:w="8000"/>
+            <w:tcBorders>
+              <w:top w:val="none" w:color="FFFFFF" w:sz="0"/>
+              <w:left w:val="none" w:color="FFFFFF" w:sz="0"/>
+              <w:bottom w:val="none" w:color="FFFFFF" w:sz="0"/>
+              <w:right w:val="none" w:color="FFFFFF" w:sz="0"/>
+            </w:tcBorders>
+          </w:tcPr>
+          <w:p>
             <w:r>
               <w:rPr>
                 <w:rFonts w:ascii="Nunito" w:cs="Nunito" w:eastAsia="Nunito" w:hAnsi="Nunito"/>
                 <w:b/>
                 <w:bCs/>
-                <w:color w:val="1E3A5F"/>
-                <w:sz w:val="20"/>
-                <w:szCs w:val="20"/>
-              </w:rPr>
-              <w:t xml:space="preserve">Datenbanken</w:t>
-            </w:r>
-          </w:p>
-        </w:tc>
-        <w:tc>
-          <w:tcPr>
-            <w:tcW w:type="dxa" w:w="7200"/>
-            <w:tcBorders>
-              <w:top w:val="none" w:color="FFFFFF" w:sz="0"/>
-              <w:left w:val="none" w:color="FFFFFF" w:sz="0"/>
-              <w:bottom w:val="none" w:color="FFFFFF" w:sz="0"/>
-              <w:right w:val="none" w:color="FFFFFF" w:sz="0"/>
-            </w:tcBorders>
-          </w:tcPr>
-          <w:p>
-            <w:pPr>
-              <w:spacing w:before="40" w:after="40"/>
-            </w:pPr>
-            <w:r>
-              <w:rPr>
-                <w:rFonts w:ascii="Nunito" w:cs="Nunito" w:eastAsia="Nunito" w:hAnsi="Nunito"/>
-                <w:sz w:val="20"/>
-                <w:szCs w:val="20"/>
-              </w:rPr>
-              <w:t xml:space="preserve">MySQL, Oracle SQL, PostgreSQL, Redis, MongoDB</w:t>
-            </w:r>
-          </w:p>
-        </w:tc>
-      </w:tr>
-      <w:tr>
-        <w:tc>
-          <w:tcPr>
-            <w:tcW w:type="dxa" w:w="2800"/>
-            <w:tcBorders>
-              <w:top w:val="none" w:color="FFFFFF" w:sz="0"/>
-              <w:left w:val="none" w:color="FFFFFF" w:sz="0"/>
-              <w:bottom w:val="none" w:color="FFFFFF" w:sz="0"/>
-              <w:right w:val="none" w:color="FFFFFF" w:sz="0"/>
-            </w:tcBorders>
-            <w:shd w:fill="F5F5F5" w:val="clear"/>
-          </w:tcPr>
-          <w:p>
-            <w:pPr>
-              <w:spacing w:before="40" w:after="40"/>
-            </w:pPr>
-            <w:r>
-              <w:rPr>
-                <w:rFonts w:ascii="Nunito" w:cs="Nunito" w:eastAsia="Nunito" w:hAnsi="Nunito"/>
-                <w:b/>
-                <w:bCs/>
-                <w:color w:val="1E3A5F"/>
-                <w:sz w:val="20"/>
-                <w:szCs w:val="20"/>
-              </w:rPr>
-              <w:t xml:space="preserve">Architektur &amp; Design</w:t>
-            </w:r>
-          </w:p>
-        </w:tc>
-        <w:tc>
-          <w:tcPr>
-            <w:tcW w:type="dxa" w:w="7200"/>
-            <w:tcBorders>
-              <w:top w:val="none" w:color="FFFFFF" w:sz="0"/>
-              <w:left w:val="none" w:color="FFFFFF" w:sz="0"/>
-              <w:bottom w:val="none" w:color="FFFFFF" w:sz="0"/>
-              <w:right w:val="none" w:color="FFFFFF" w:sz="0"/>
-            </w:tcBorders>
-            <w:shd w:fill="F5F5F5" w:val="clear"/>
-          </w:tcPr>
-          <w:p>
-            <w:pPr>
-              <w:spacing w:before="40" w:after="40"/>
-            </w:pPr>
-            <w:r>
-              <w:rPr>
-                <w:rFonts w:ascii="Nunito" w:cs="Nunito" w:eastAsia="Nunito" w:hAnsi="Nunito"/>
-                <w:sz w:val="20"/>
-                <w:szCs w:val="20"/>
-              </w:rPr>
-              <w:t xml:space="preserve">Domain-Driven Design, Microservices, Event-Driven Architecture</w:t>
-            </w:r>
-          </w:p>
-        </w:tc>
-      </w:tr>
-      <w:tr>
-        <w:tc>
-          <w:tcPr>
-            <w:tcW w:type="dxa" w:w="2800"/>
-            <w:tcBorders>
-              <w:top w:val="none" w:color="FFFFFF" w:sz="0"/>
-              <w:left w:val="none" w:color="FFFFFF" w:sz="0"/>
-              <w:bottom w:val="none" w:color="FFFFFF" w:sz="0"/>
-              <w:right w:val="none" w:color="FFFFFF" w:sz="0"/>
-            </w:tcBorders>
-          </w:tcPr>
-          <w:p>
-            <w:pPr>
-              <w:spacing w:before="40" w:after="40"/>
-            </w:pPr>
-            <w:r>
-              <w:rPr>
-                <w:rFonts w:ascii="Nunito" w:cs="Nunito" w:eastAsia="Nunito" w:hAnsi="Nunito"/>
-                <w:b/>
-                <w:bCs/>
-                <w:color w:val="1E3A5F"/>
-                <w:sz w:val="20"/>
-                <w:szCs w:val="20"/>
-              </w:rPr>
-              <w:t xml:space="preserve">Protokolle &amp; APIs</w:t>
-            </w:r>
-          </w:p>
-        </w:tc>
-        <w:tc>
-          <w:tcPr>
-            <w:tcW w:type="dxa" w:w="7200"/>
-            <w:tcBorders>
-              <w:top w:val="none" w:color="FFFFFF" w:sz="0"/>
-              <w:left w:val="none" w:color="FFFFFF" w:sz="0"/>
-              <w:bottom w:val="none" w:color="FFFFFF" w:sz="0"/>
-              <w:right w:val="none" w:color="FFFFFF" w:sz="0"/>
-            </w:tcBorders>
-          </w:tcPr>
-          <w:p>
-            <w:pPr>
-              <w:spacing w:before="40" w:after="40"/>
-            </w:pPr>
-            <w:r>
-              <w:rPr>
-                <w:rFonts w:ascii="Nunito" w:cs="Nunito" w:eastAsia="Nunito" w:hAnsi="Nunito"/>
-                <w:sz w:val="20"/>
-                <w:szCs w:val="20"/>
-              </w:rPr>
-              <w:t xml:space="preserve">REST, SOAP, GraphQL, Swagger/OpenAPI, MQTT, WebSocket</w:t>
-            </w:r>
-          </w:p>
-        </w:tc>
-      </w:tr>
-      <w:tr>
-        <w:tc>
-          <w:tcPr>
-            <w:tcW w:type="dxa" w:w="2800"/>
-            <w:tcBorders>
-              <w:top w:val="none" w:color="FFFFFF" w:sz="0"/>
-              <w:left w:val="none" w:color="FFFFFF" w:sz="0"/>
-              <w:bottom w:val="none" w:color="FFFFFF" w:sz="0"/>
-              <w:right w:val="none" w:color="FFFFFF" w:sz="0"/>
-            </w:tcBorders>
-            <w:shd w:fill="F5F5F5" w:val="clear"/>
-          </w:tcPr>
-          <w:p>
-            <w:pPr>
-              <w:spacing w:before="40" w:after="40"/>
-            </w:pPr>
-            <w:r>
-              <w:rPr>
-                <w:rFonts w:ascii="Nunito" w:cs="Nunito" w:eastAsia="Nunito" w:hAnsi="Nunito"/>
-                <w:b/>
-                <w:bCs/>
-                <w:color w:val="1E3A5F"/>
-                <w:sz w:val="20"/>
-                <w:szCs w:val="20"/>
-              </w:rPr>
-              <w:t xml:space="preserve">Observability</w:t>
-            </w:r>
-          </w:p>
-        </w:tc>
-        <w:tc>
-          <w:tcPr>
-            <w:tcW w:type="dxa" w:w="7200"/>
-            <w:tcBorders>
-              <w:top w:val="none" w:color="FFFFFF" w:sz="0"/>
-              <w:left w:val="none" w:color="FFFFFF" w:sz="0"/>
-              <w:bottom w:val="none" w:color="FFFFFF" w:sz="0"/>
-              <w:right w:val="none" w:color="FFFFFF" w:sz="0"/>
-            </w:tcBorders>
-            <w:shd w:fill="F5F5F5" w:val="clear"/>
-          </w:tcPr>
-          <w:p>
-            <w:pPr>
-              <w:spacing w:before="40" w:after="40"/>
-            </w:pPr>
-            <w:r>
-              <w:rPr>
-                <w:rFonts w:ascii="Nunito" w:cs="Nunito" w:eastAsia="Nunito" w:hAnsi="Nunito"/>
-                <w:sz w:val="20"/>
-                <w:szCs w:val="20"/>
-              </w:rPr>
-              <w:t xml:space="preserve">Grafana, Prometheus, ELK Stack, Application Logging</w:t>
-            </w:r>
-          </w:p>
-        </w:tc>
-      </w:tr>
-      <w:tr>
-        <w:tc>
-          <w:tcPr>
-            <w:tcW w:type="dxa" w:w="2800"/>
-            <w:tcBorders>
-              <w:top w:val="none" w:color="FFFFFF" w:sz="0"/>
-              <w:left w:val="none" w:color="FFFFFF" w:sz="0"/>
-              <w:bottom w:val="none" w:color="FFFFFF" w:sz="0"/>
-              <w:right w:val="none" w:color="FFFFFF" w:sz="0"/>
-            </w:tcBorders>
-          </w:tcPr>
-          <w:p>
-            <w:pPr>
-              <w:spacing w:before="40" w:after="40"/>
-            </w:pPr>
-            <w:r>
-              <w:rPr>
-                <w:rFonts w:ascii="Nunito" w:cs="Nunito" w:eastAsia="Nunito" w:hAnsi="Nunito"/>
-                <w:b/>
-                <w:bCs/>
-                <w:color w:val="1E3A5F"/>
-                <w:sz w:val="20"/>
-                <w:szCs w:val="20"/>
-              </w:rPr>
-              <w:t xml:space="preserve">Security</w:t>
-            </w:r>
-          </w:p>
-        </w:tc>
-        <w:tc>
-          <w:tcPr>
-            <w:tcW w:type="dxa" w:w="7200"/>
-            <w:tcBorders>
-              <w:top w:val="none" w:color="FFFFFF" w:sz="0"/>
-              <w:left w:val="none" w:color="FFFFFF" w:sz="0"/>
-              <w:bottom w:val="none" w:color="FFFFFF" w:sz="0"/>
-              <w:right w:val="none" w:color="FFFFFF" w:sz="0"/>
-            </w:tcBorders>
-          </w:tcPr>
-          <w:p>
-            <w:pPr>
-              <w:spacing w:before="40" w:after="40"/>
-            </w:pPr>
-            <w:r>
-              <w:rPr>
-                <w:rFonts w:ascii="Nunito" w:cs="Nunito" w:eastAsia="Nunito" w:hAnsi="Nunito"/>
-                <w:sz w:val="20"/>
-                <w:szCs w:val="20"/>
-              </w:rPr>
-              <w:t xml:space="preserve">OAuth2, TLS/SSL, LDAP, Identity Provider Integration</w:t>
-            </w:r>
-          </w:p>
-        </w:tc>
-      </w:tr>
-      <w:tr>
-        <w:tc>
-          <w:tcPr>
-            <w:tcW w:type="dxa" w:w="2800"/>
-            <w:tcBorders>
-              <w:top w:val="none" w:color="FFFFFF" w:sz="0"/>
-              <w:left w:val="none" w:color="FFFFFF" w:sz="0"/>
-              <w:bottom w:val="none" w:color="FFFFFF" w:sz="0"/>
-              <w:right w:val="none" w:color="FFFFFF" w:sz="0"/>
-            </w:tcBorders>
-            <w:shd w:fill="F5F5F5" w:val="clear"/>
-          </w:tcPr>
-          <w:p>
-            <w:pPr>
-              <w:spacing w:before="40" w:after="40"/>
-            </w:pPr>
-            <w:r>
-              <w:rPr>
-                <w:rFonts w:ascii="Nunito" w:cs="Nunito" w:eastAsia="Nunito" w:hAnsi="Nunito"/>
-                <w:b/>
-                <w:bCs/>
-                <w:color w:val="1E3A5F"/>
-                <w:sz w:val="20"/>
-                <w:szCs w:val="20"/>
-              </w:rPr>
-              <w:t xml:space="preserve">Methodik</w:t>
-            </w:r>
-          </w:p>
-        </w:tc>
-        <w:tc>
-          <w:tcPr>
-            <w:tcW w:type="dxa" w:w="7200"/>
-            <w:tcBorders>
-              <w:top w:val="none" w:color="FFFFFF" w:sz="0"/>
-              <w:left w:val="none" w:color="FFFFFF" w:sz="0"/>
-              <w:bottom w:val="none" w:color="FFFFFF" w:sz="0"/>
-              <w:right w:val="none" w:color="FFFFFF" w:sz="0"/>
-            </w:tcBorders>
-            <w:shd w:fill="F5F5F5" w:val="clear"/>
-          </w:tcPr>
-          <w:p>
-            <w:pPr>
-              <w:spacing w:before="40" w:after="40"/>
-            </w:pPr>
-            <w:r>
-              <w:rPr>
-                <w:rFonts w:ascii="Nunito" w:cs="Nunito" w:eastAsia="Nunito" w:hAnsi="Nunito"/>
-                <w:sz w:val="20"/>
-                <w:szCs w:val="20"/>
-              </w:rPr>
-              <w:t xml:space="preserve">Scrum, Kanban, Requirements Engineering, Code Review</w:t>
-            </w:r>
-          </w:p>
-        </w:tc>
-      </w:tr>
-      <w:tr>
-        <w:tc>
-          <w:tcPr>
-            <w:tcW w:type="dxa" w:w="2800"/>
-            <w:tcBorders>
-              <w:top w:val="none" w:color="FFFFFF" w:sz="0"/>
-              <w:left w:val="none" w:color="FFFFFF" w:sz="0"/>
-              <w:bottom w:val="none" w:color="FFFFFF" w:sz="0"/>
-              <w:right w:val="none" w:color="FFFFFF" w:sz="0"/>
-            </w:tcBorders>
-          </w:tcPr>
-          <w:p>
-            <w:pPr>
-              <w:spacing w:before="40" w:after="40"/>
-            </w:pPr>
-            <w:r>
-              <w:rPr>
-                <w:rFonts w:ascii="Nunito" w:cs="Nunito" w:eastAsia="Nunito" w:hAnsi="Nunito"/>
-                <w:b/>
-                <w:bCs/>
-                <w:color w:val="1E3A5F"/>
-                <w:sz w:val="20"/>
-                <w:szCs w:val="20"/>
-              </w:rPr>
-              <w:t xml:space="preserve">Domänen</w:t>
-            </w:r>
-          </w:p>
-        </w:tc>
-        <w:tc>
-          <w:tcPr>
-            <w:tcW w:type="dxa" w:w="7200"/>
-            <w:tcBorders>
-              <w:top w:val="none" w:color="FFFFFF" w:sz="0"/>
-              <w:left w:val="none" w:color="FFFFFF" w:sz="0"/>
-              <w:bottom w:val="none" w:color="FFFFFF" w:sz="0"/>
-              <w:right w:val="none" w:color="FFFFFF" w:sz="0"/>
-            </w:tcBorders>
-          </w:tcPr>
-          <w:p>
-            <w:pPr>
-              <w:spacing w:before="40" w:after="40"/>
-            </w:pPr>
-            <w:r>
-              <w:rPr>
-                <w:rFonts w:ascii="Nunito" w:cs="Nunito" w:eastAsia="Nunito" w:hAnsi="Nunito"/>
-                <w:sz w:val="20"/>
-                <w:szCs w:val="20"/>
-              </w:rPr>
-              <w:t xml:space="preserve">IoT, Smart Home, Embedded Systems, Linux-Treiber, Enterprise-Software, Automotive</w:t>
+              </w:rPr>
+              <w:t xml:space="preserve">Elevator Pitch BW Regionalcup – Gewinner</w:t>
+            </w:r>
+          </w:p>
+          <w:p>
+            <w:r>
+              <w:rPr>
+                <w:rFonts w:ascii="Nunito" w:cs="Nunito" w:eastAsia="Nunito" w:hAnsi="Nunito"/>
+                <w:color w:val="666666"/>
+                <w:sz w:val="20"/>
+                <w:szCs w:val="20"/>
+              </w:rPr>
+              <w:t xml:space="preserve">Region Südschwarzwald</w:t>
             </w:r>
           </w:p>
         </w:tc>
@@ -3702,7 +3698,7 @@
           </w:tcPr>
           <w:p>
             <w:pPr>
-              <w:jc w:val="center"/>
+              <w:jc w:val="left"/>
             </w:pPr>
             <w:r>
               <w:rPr>
@@ -3715,7 +3711,7 @@
           </w:p>
           <w:p>
             <w:pPr>
-              <w:jc w:val="center"/>
+              <w:jc w:val="left"/>
             </w:pPr>
             <w:r>
               <w:rPr>
@@ -3740,7 +3736,7 @@
           </w:tcPr>
           <w:p>
             <w:pPr>
-              <w:jc w:val="center"/>
+              <w:jc w:val="left"/>
             </w:pPr>
             <w:r>
               <w:rPr>
@@ -3753,7 +3749,7 @@
           </w:p>
           <w:p>
             <w:pPr>
-              <w:jc w:val="center"/>
+              <w:jc w:val="left"/>
             </w:pPr>
             <w:r>
               <w:rPr>
@@ -3778,7 +3774,7 @@
           </w:tcPr>
           <w:p>
             <w:pPr>
-              <w:jc w:val="center"/>
+              <w:jc w:val="left"/>
             </w:pPr>
             <w:r>
               <w:rPr>
@@ -3791,7 +3787,7 @@
           </w:p>
           <w:p>
             <w:pPr>
-              <w:jc w:val="center"/>
+              <w:jc w:val="left"/>
             </w:pPr>
             <w:r>
               <w:rPr>
@@ -3816,7 +3812,7 @@
           </w:tcPr>
           <w:p>
             <w:pPr>
-              <w:jc w:val="center"/>
+              <w:jc w:val="left"/>
             </w:pPr>
             <w:r>
               <w:rPr>
@@ -3829,7 +3825,7 @@
           </w:p>
           <w:p>
             <w:pPr>
-              <w:jc w:val="center"/>
+              <w:jc w:val="left"/>
             </w:pPr>
             <w:r>
               <w:rPr>
@@ -3854,7 +3850,7 @@
           </w:tcPr>
           <w:p>
             <w:pPr>
-              <w:jc w:val="center"/>
+              <w:jc w:val="left"/>
             </w:pPr>
             <w:r>
               <w:rPr>
@@ -3867,7 +3863,7 @@
           </w:p>
           <w:p>
             <w:pPr>
-              <w:jc w:val="center"/>
+              <w:jc w:val="left"/>
             </w:pPr>
             <w:r>
               <w:rPr>
@@ -3882,11 +3878,6 @@
         </w:tc>
       </w:tr>
     </w:tbl>
-    <w:p>
-      <w:pPr>
-        <w:spacing w:before="300"/>
-      </w:pPr>
-    </w:p>
     <w:sectPr>
       <w:headerReference w:type="default" r:id="rId6"/>
       <w:footerReference w:type="default" r:id="rId7"/>
@@ -4101,12 +4092,6 @@
     </w:lvlOverride>
   </w:num>
   <w:num w:numId="2">
-    <w:abstractNumId w:val="2"/>
-    <w:lvlOverride w:ilvl="0">
-      <w:startOverride w:val="1"/>
-    </w:lvlOverride>
-  </w:num>
-  <w:num w:numId="3">
     <w:abstractNumId w:val="3"/>
     <w:lvlOverride w:ilvl="0">
       <w:startOverride w:val="1"/>
@@ -4293,7 +4278,7 @@
     <w:name w:val="SectionHeader"/>
     <w:basedOn w:val="Normal"/>
     <w:pPr>
-      <w:spacing w:before="400" w:after="200"/>
+      <w:spacing w:before="400" w:after="150"/>
     </w:pPr>
     <w:rPr>
       <w:rFonts w:ascii="Nunito" w:cs="Nunito" w:eastAsia="Nunito" w:hAnsi="Nunito"/>
@@ -4309,7 +4294,7 @@
     <w:name w:val="ProjectTitle"/>
     <w:basedOn w:val="Normal"/>
     <w:pPr>
-      <w:spacing w:before="200" w:after="60"/>
+      <w:spacing w:before="340" w:after="60"/>
     </w:pPr>
     <w:rPr>
       <w:rFonts w:ascii="Nunito" w:cs="Nunito" w:eastAsia="Nunito" w:hAnsi="Nunito"/>

</xml_diff>

<commit_message>
Extract content to JSON, add ES/PT languages and personal variants
- All CV content now lives in data/cv.{de,en,es,pt}.json (single source of
  truth, shared with the website); generator scripts contain layout only
- New Spanish and Portuguese generators
- New --personal variant per language (no twiceD branding) with own
  profile label and projects note (projectsNotePersonal, profilePersonal)
- generate_all.sh builds all 8 DOCX variants and converts to PDF
- Regenerated all outputs
</commit_message>
<xml_diff>
--- a/TD_Daniel_Deusing_DE.docx
+++ b/TD_Daniel_Deusing_DE.docx
@@ -108,7 +108,7 @@
               </w:rPr>
               <w:t xml:space="preserve"> </w:t>
             </w:r>
-            <w:hyperlink w:history="1" r:id="rIdeng-n4xgtqjsfou_dplrz">
+            <w:hyperlink w:history="1" r:id="rIdc_j_sqsh9rudkb1_fhyom">
               <w:r>
                 <w:rPr>
                   <w:rFonts w:ascii="Nunito" w:cs="Nunito" w:eastAsia="Nunito" w:hAnsi="Nunito"/>
@@ -175,7 +175,7 @@
               </w:rPr>
               <w:t xml:space="preserve"> </w:t>
             </w:r>
-            <w:hyperlink w:history="1" r:id="rIdlwny5j9q0aersgfazoua8">
+            <w:hyperlink w:history="1" r:id="rIdgfz3uidhdfjsgh1uwvl-z">
               <w:r>
                 <w:rPr>
                   <w:rFonts w:ascii="Nunito" w:cs="Nunito" w:eastAsia="Nunito" w:hAnsi="Nunito"/>
@@ -242,7 +242,7 @@
               </w:rPr>
               <w:t xml:space="preserve"> </w:t>
             </w:r>
-            <w:hyperlink w:history="1" r:id="rIdpmsodvoczjesqomfx5iu8">
+            <w:hyperlink w:history="1" r:id="rIdyzaiu_xrb9vckxvf5ex2y">
               <w:r>
                 <w:rPr>
                   <w:rFonts w:ascii="Nunito" w:cs="Nunito" w:eastAsia="Nunito" w:hAnsi="Nunito"/>
@@ -379,7 +379,7 @@
         </w:rPr>
         <w:t xml:space="preserve">Eine vollständige Projektübersicht befindet sich derzeit im Aufbau unter </w:t>
       </w:r>
-      <w:hyperlink w:history="1" r:id="rIdqj0g-tu0migpmtdtlvqlr">
+      <w:hyperlink w:history="1" r:id="rIdr2fbptb2bmea331umsdot">
         <w:r>
           <w:rPr>
             <w:rFonts w:ascii="Nunito" w:cs="Nunito" w:eastAsia="Nunito" w:hAnsi="Nunito"/>
@@ -2141,7 +2141,7 @@
         <w:pStyle w:val="CompanyRole"/>
       </w:pPr>
       <w:r>
-        <w:t xml:space="preserve">4NEEDS | Blockchain-Entwickler | 01/2018 – 10/2018</w:t>
+        <w:t xml:space="preserve">4NEEDS | Blockchain-Entwickler | 2018</w:t>
       </w:r>
     </w:p>
     <w:p>
@@ -2243,7 +2243,7 @@
         <w:pStyle w:val="CompanyRole"/>
       </w:pPr>
       <w:r>
-        <w:t xml:space="preserve">PLC2 Design GmbH | Embedded-Entwickler | 08/2017 – 12/2017</w:t>
+        <w:t xml:space="preserve">PLC2 Design GmbH | Embedded-Entwickler | 2017</w:t>
       </w:r>
     </w:p>
     <w:p>
@@ -2464,7 +2464,7 @@
         <w:pStyle w:val="CompanyRole"/>
       </w:pPr>
       <w:r>
-        <w:t xml:space="preserve">SafeGuard Solutions GmbH | Android-Entwickler | 05/2015 – 02/2017</w:t>
+        <w:t xml:space="preserve">SafeGuard Solutions GmbH | Android-Entwickler | 2015 – 2017</w:t>
       </w:r>
     </w:p>
     <w:p>
@@ -2583,7 +2583,7 @@
         <w:pStyle w:val="CompanyRole"/>
       </w:pPr>
       <w:r>
-        <w:t xml:space="preserve">Elaborated Networks GmbH | Backend-Entwickler | 12/2014 – 01/2015</w:t>
+        <w:t xml:space="preserve">Elaborated Networks GmbH | Backend-Entwickler | 2014 – 2015</w:t>
       </w:r>
     </w:p>
     <w:p>
@@ -2668,7 +2668,7 @@
         <w:pStyle w:val="CompanyRole"/>
       </w:pPr>
       <w:r>
-        <w:t xml:space="preserve">Eigenes Startup | Co-Gründer | 03/2013 – 12/2014</w:t>
+        <w:t xml:space="preserve">Eigenes Startup | Co-Gründer | 2013 – 2014</w:t>
       </w:r>
     </w:p>
     <w:p>
@@ -2753,7 +2753,7 @@
         <w:pStyle w:val="CompanyRole"/>
       </w:pPr>
       <w:r>
-        <w:t xml:space="preserve">Visioneering AG | Softwareentwickler | 07/2011 – 10/2012</w:t>
+        <w:t xml:space="preserve">Visioneering AG | Softwareentwickler | 2011 – 2012</w:t>
       </w:r>
     </w:p>
     <w:p>

</xml_diff>